<commit_message>
Docs: make readable - change Aptos to Calibri and fix bullet separators
- Replace ' • ' bullet with ' | ' for readability (was showing as â€¢ mojibake)
- Change 455 runs from Aptos/Aptos Display to Calibri (widely available, readable)
- Keep Consolas for code blocks
- Ensures For Local Farmers in India | Hindi-First | Mobile-First displays correctly on all systems
</commit_message>
<xml_diff>
--- a/Krishi_Yantra_Documentation.docx
+++ b/Krishi_Yantra_Documentation.docx
@@ -29,7 +29,7 @@
       </w:pPr>
       <w:r>
         <w:rPr>
-          <w:rFonts w:ascii="Aptos Display" w:hAnsi="Aptos Display"/>
+          <w:rFonts w:ascii="Calibri" w:hAnsi="Calibri"/>
           <w:b/>
           <w:color w:val="16202A"/>
           <w:sz w:val="56"/>
@@ -44,7 +44,7 @@
       </w:pPr>
       <w:r>
         <w:rPr>
-          <w:rFonts w:ascii="Aptos" w:hAnsi="Aptos"/>
+          <w:rFonts w:ascii="Calibri" w:hAnsi="Calibri"/>
           <w:i/>
           <w:color w:val="595959"/>
           <w:sz w:val="24"/>
@@ -58,12 +58,12 @@
       </w:pPr>
       <w:r>
         <w:rPr>
-          <w:rFonts w:ascii="Aptos" w:hAnsi="Aptos"/>
+          <w:rFonts w:ascii="Calibri" w:hAnsi="Calibri"/>
           <w:b/>
           <w:color w:val="2E7D32"/>
           <w:sz w:val="20"/>
         </w:rPr>
-        <w:t>For Local Farmers in India  â€¢  Hindi-First  â€¢  Mobile-First</w:t>
+        <w:t>For Local Farmers in India  |  Hindi-First  |  Mobile-First</w:t>
       </w:r>
     </w:p>
     <w:p/>
@@ -74,7 +74,7 @@
       </w:pPr>
       <w:r>
         <w:rPr>
-          <w:rFonts w:ascii="Aptos" w:hAnsi="Aptos"/>
+          <w:rFonts w:ascii="Calibri" w:hAnsi="Calibri"/>
           <w:b/>
           <w:color w:val="16202A"/>
           <w:sz w:val="22"/>
@@ -88,11 +88,11 @@
       </w:pPr>
       <w:r>
         <w:rPr>
-          <w:rFonts w:ascii="Aptos" w:hAnsi="Aptos"/>
+          <w:rFonts w:ascii="Calibri" w:hAnsi="Calibri"/>
           <w:color w:val="808080"/>
           <w:sz w:val="16"/>
         </w:rPr>
-        <w:t>Full-Stack  â€¢  Node.js + Express + SQLite + Vanilla JavaScript  â€¢  Vercel + GitHub</w:t>
+        <w:t>Full-Stack  |  Node.js + Express + SQLite + Vanilla JavaScript  |  Vercel + GitHub</w:t>
       </w:r>
     </w:p>
     <w:p/>
@@ -117,7 +117,7 @@
             </w:pPr>
             <w:r>
               <w:rPr>
-                <w:rFonts w:ascii="Aptos" w:hAnsi="Aptos"/>
+                <w:rFonts w:ascii="Calibri" w:hAnsi="Calibri"/>
                 <w:b/>
                 <w:color w:val="16202A"/>
                 <w:sz w:val="16"/>
@@ -136,7 +136,7 @@
             </w:pPr>
             <w:r>
               <w:rPr>
-                <w:rFonts w:ascii="Aptos" w:hAnsi="Aptos"/>
+                <w:rFonts w:ascii="Calibri" w:hAnsi="Calibri"/>
                 <w:b/>
                 <w:color w:val="16202A"/>
                 <w:sz w:val="16"/>
@@ -154,11 +154,11 @@
       </w:pPr>
       <w:r>
         <w:rPr>
-          <w:rFonts w:ascii="Aptos" w:hAnsi="Aptos"/>
+          <w:rFonts w:ascii="Calibri" w:hAnsi="Calibri"/>
           <w:color w:val="A0A0A0"/>
           <w:sz w:val="14"/>
         </w:rPr>
-        <w:t>Version 1.0  â€¢  August 2025  â€¢  11 Pages  â€¢  18 REST Endpoints  â€¢  45/45 Tasks Completed</w:t>
+        <w:t>Version 1.0  |  August 2025  |  11 Pages  |  18 REST Endpoints  |  45/45 Tasks Completed</w:t>
       </w:r>
     </w:p>
     <w:p>
@@ -173,7 +173,7 @@
       </w:pPr>
       <w:r>
         <w:rPr>
-          <w:rFonts w:ascii="Aptos" w:hAnsi="Aptos"/>
+          <w:rFonts w:ascii="Calibri" w:hAnsi="Calibri"/>
           <w:b/>
           <w:color w:val="16202A"/>
           <w:sz w:val="32"/>
@@ -188,7 +188,7 @@
       </w:pPr>
       <w:r>
         <w:rPr>
-          <w:rFonts w:ascii="Aptos" w:hAnsi="Aptos"/>
+          <w:rFonts w:ascii="Calibri" w:hAnsi="Calibri"/>
           <w:color w:val="404040"/>
           <w:sz w:val="20"/>
         </w:rPr>
@@ -202,7 +202,7 @@
       </w:pPr>
       <w:r>
         <w:rPr>
-          <w:rFonts w:ascii="Aptos" w:hAnsi="Aptos"/>
+          <w:rFonts w:ascii="Calibri" w:hAnsi="Calibri"/>
           <w:color w:val="404040"/>
           <w:sz w:val="20"/>
         </w:rPr>
@@ -216,7 +216,7 @@
       </w:pPr>
       <w:r>
         <w:rPr>
-          <w:rFonts w:ascii="Aptos" w:hAnsi="Aptos"/>
+          <w:rFonts w:ascii="Calibri" w:hAnsi="Calibri"/>
           <w:color w:val="404040"/>
           <w:sz w:val="20"/>
         </w:rPr>
@@ -230,7 +230,7 @@
       </w:pPr>
       <w:r>
         <w:rPr>
-          <w:rFonts w:ascii="Aptos" w:hAnsi="Aptos"/>
+          <w:rFonts w:ascii="Calibri" w:hAnsi="Calibri"/>
           <w:color w:val="404040"/>
           <w:sz w:val="20"/>
         </w:rPr>
@@ -244,7 +244,7 @@
       </w:pPr>
       <w:r>
         <w:rPr>
-          <w:rFonts w:ascii="Aptos" w:hAnsi="Aptos"/>
+          <w:rFonts w:ascii="Calibri" w:hAnsi="Calibri"/>
           <w:color w:val="404040"/>
           <w:sz w:val="20"/>
         </w:rPr>
@@ -258,7 +258,7 @@
       </w:pPr>
       <w:r>
         <w:rPr>
-          <w:rFonts w:ascii="Aptos" w:hAnsi="Aptos"/>
+          <w:rFonts w:ascii="Calibri" w:hAnsi="Calibri"/>
           <w:color w:val="404040"/>
           <w:sz w:val="20"/>
         </w:rPr>
@@ -272,7 +272,7 @@
       </w:pPr>
       <w:r>
         <w:rPr>
-          <w:rFonts w:ascii="Aptos" w:hAnsi="Aptos"/>
+          <w:rFonts w:ascii="Calibri" w:hAnsi="Calibri"/>
           <w:color w:val="404040"/>
           <w:sz w:val="20"/>
         </w:rPr>
@@ -286,7 +286,7 @@
       </w:pPr>
       <w:r>
         <w:rPr>
-          <w:rFonts w:ascii="Aptos" w:hAnsi="Aptos"/>
+          <w:rFonts w:ascii="Calibri" w:hAnsi="Calibri"/>
           <w:color w:val="404040"/>
           <w:sz w:val="20"/>
         </w:rPr>
@@ -300,7 +300,7 @@
       </w:pPr>
       <w:r>
         <w:rPr>
-          <w:rFonts w:ascii="Aptos" w:hAnsi="Aptos"/>
+          <w:rFonts w:ascii="Calibri" w:hAnsi="Calibri"/>
           <w:color w:val="404040"/>
           <w:sz w:val="20"/>
         </w:rPr>
@@ -314,7 +314,7 @@
       </w:pPr>
       <w:r>
         <w:rPr>
-          <w:rFonts w:ascii="Aptos" w:hAnsi="Aptos"/>
+          <w:rFonts w:ascii="Calibri" w:hAnsi="Calibri"/>
           <w:color w:val="404040"/>
           <w:sz w:val="20"/>
         </w:rPr>
@@ -328,7 +328,7 @@
       </w:pPr>
       <w:r>
         <w:rPr>
-          <w:rFonts w:ascii="Aptos" w:hAnsi="Aptos"/>
+          <w:rFonts w:ascii="Calibri" w:hAnsi="Calibri"/>
           <w:color w:val="404040"/>
           <w:sz w:val="20"/>
         </w:rPr>
@@ -342,7 +342,7 @@
       </w:pPr>
       <w:r>
         <w:rPr>
-          <w:rFonts w:ascii="Aptos" w:hAnsi="Aptos"/>
+          <w:rFonts w:ascii="Calibri" w:hAnsi="Calibri"/>
           <w:color w:val="404040"/>
           <w:sz w:val="20"/>
         </w:rPr>
@@ -361,7 +361,7 @@
       </w:pPr>
       <w:r>
         <w:rPr>
-          <w:rFonts w:ascii="Aptos" w:hAnsi="Aptos"/>
+          <w:rFonts w:ascii="Calibri" w:hAnsi="Calibri"/>
           <w:b/>
           <w:color w:val="16202A"/>
           <w:sz w:val="32"/>
@@ -390,7 +390,7 @@
             </w:pPr>
             <w:r>
               <w:rPr>
-                <w:rFonts w:ascii="Aptos" w:hAnsi="Aptos"/>
+                <w:rFonts w:ascii="Calibri" w:hAnsi="Calibri"/>
                 <w:b/>
                 <w:i/>
                 <w:color w:val="16202A"/>
@@ -413,7 +413,7 @@
       </w:pPr>
       <w:r>
         <w:rPr>
-          <w:rFonts w:ascii="Aptos" w:hAnsi="Aptos"/>
+          <w:rFonts w:ascii="Calibri" w:hAnsi="Calibri"/>
           <w:b w:val="0"/>
           <w:i w:val="0"/>
           <w:color w:val="404040"/>
@@ -428,7 +428,7 @@
       </w:pPr>
       <w:r>
         <w:rPr>
-          <w:rFonts w:ascii="Aptos" w:hAnsi="Aptos"/>
+          <w:rFonts w:ascii="Calibri" w:hAnsi="Calibri"/>
           <w:b w:val="0"/>
           <w:i w:val="0"/>
           <w:color w:val="404040"/>
@@ -443,7 +443,7 @@
       </w:pPr>
       <w:r>
         <w:rPr>
-          <w:rFonts w:ascii="Aptos" w:hAnsi="Aptos"/>
+          <w:rFonts w:ascii="Calibri" w:hAnsi="Calibri"/>
           <w:b w:val="0"/>
           <w:i w:val="0"/>
           <w:color w:val="404040"/>
@@ -459,7 +459,7 @@
       </w:pPr>
       <w:r>
         <w:rPr>
-          <w:rFonts w:ascii="Aptos" w:hAnsi="Aptos"/>
+          <w:rFonts w:ascii="Calibri" w:hAnsi="Calibri"/>
           <w:b/>
           <w:color w:val="16202A"/>
           <w:sz w:val="24"/>
@@ -473,7 +473,7 @@
       </w:pPr>
       <w:r>
         <w:rPr>
-          <w:rFonts w:ascii="Aptos" w:hAnsi="Aptos"/>
+          <w:rFonts w:ascii="Calibri" w:hAnsi="Calibri"/>
           <w:b w:val="0"/>
           <w:i/>
           <w:color w:val="595959"/>
@@ -488,7 +488,7 @@
       </w:pPr>
       <w:r>
         <w:rPr>
-          <w:rFonts w:ascii="Aptos" w:hAnsi="Aptos"/>
+          <w:rFonts w:ascii="Calibri" w:hAnsi="Calibri"/>
           <w:b/>
           <w:i w:val="0"/>
           <w:color w:val="16202A"/>
@@ -504,7 +504,7 @@
       </w:pPr>
       <w:r>
         <w:rPr>
-          <w:rFonts w:ascii="Aptos" w:hAnsi="Aptos"/>
+          <w:rFonts w:ascii="Calibri" w:hAnsi="Calibri"/>
           <w:b/>
           <w:color w:val="16202A"/>
           <w:sz w:val="32"/>
@@ -519,7 +519,7 @@
       </w:pPr>
       <w:r>
         <w:rPr>
-          <w:rFonts w:ascii="Aptos" w:hAnsi="Aptos"/>
+          <w:rFonts w:ascii="Calibri" w:hAnsi="Calibri"/>
           <w:b/>
           <w:color w:val="16202A"/>
           <w:sz w:val="24"/>
@@ -533,7 +533,7 @@
       </w:pPr>
       <w:r>
         <w:rPr>
-          <w:rFonts w:ascii="Aptos" w:hAnsi="Aptos"/>
+          <w:rFonts w:ascii="Calibri" w:hAnsi="Calibri"/>
           <w:b w:val="0"/>
           <w:i w:val="0"/>
           <w:color w:val="404040"/>
@@ -548,7 +548,7 @@
       </w:pPr>
       <w:r>
         <w:rPr>
-          <w:rFonts w:ascii="Aptos" w:hAnsi="Aptos"/>
+          <w:rFonts w:ascii="Calibri" w:hAnsi="Calibri"/>
           <w:b w:val="0"/>
           <w:i w:val="0"/>
           <w:color w:val="404040"/>
@@ -564,7 +564,7 @@
       </w:pPr>
       <w:r>
         <w:rPr>
-          <w:rFonts w:ascii="Aptos" w:hAnsi="Aptos"/>
+          <w:rFonts w:ascii="Calibri" w:hAnsi="Calibri"/>
           <w:b/>
           <w:color w:val="16202A"/>
           <w:sz w:val="24"/>
@@ -579,7 +579,7 @@
       </w:pPr>
       <w:r>
         <w:rPr>
-          <w:rFonts w:ascii="Aptos" w:hAnsi="Aptos"/>
+          <w:rFonts w:ascii="Calibri" w:hAnsi="Calibri"/>
           <w:sz w:val="20"/>
         </w:rPr>
         <w:t>Small &amp; marginal farmers (2â€“5 acres) needing tractors/harvesters for short windows</w:t>
@@ -592,7 +592,7 @@
       </w:pPr>
       <w:r>
         <w:rPr>
-          <w:rFonts w:ascii="Aptos" w:hAnsi="Aptos"/>
+          <w:rFonts w:ascii="Calibri" w:hAnsi="Calibri"/>
           <w:sz w:val="20"/>
         </w:rPr>
         <w:t>Equipment owners (often the same village) wanting to earn from idle machines</w:t>
@@ -605,7 +605,7 @@
       </w:pPr>
       <w:r>
         <w:rPr>
-          <w:rFonts w:ascii="Aptos" w:hAnsi="Aptos"/>
+          <w:rFonts w:ascii="Calibri" w:hAnsi="Calibri"/>
           <w:sz w:val="20"/>
         </w:rPr>
         <w:t>Rural youth as local operators/middlemen digitizing the process</w:t>
@@ -618,7 +618,7 @@
       </w:pPr>
       <w:r>
         <w:rPr>
-          <w:rFonts w:ascii="Aptos" w:hAnsi="Aptos"/>
+          <w:rFonts w:ascii="Calibri" w:hAnsi="Calibri"/>
           <w:sz w:val="20"/>
         </w:rPr>
         <w:t>IT volunteers in Krishi Vigyan Kendras managing listings</w:t>
@@ -631,7 +631,7 @@
       </w:pPr>
       <w:r>
         <w:rPr>
-          <w:rFonts w:ascii="Aptos" w:hAnsi="Aptos"/>
+          <w:rFonts w:ascii="Calibri" w:hAnsi="Calibri"/>
           <w:b/>
           <w:color w:val="16202A"/>
           <w:sz w:val="24"/>
@@ -663,7 +663,7 @@
             </w:pPr>
             <w:r>
               <w:rPr>
-                <w:rFonts w:ascii="Aptos" w:hAnsi="Aptos"/>
+                <w:rFonts w:ascii="Calibri" w:hAnsi="Calibri"/>
                 <w:b/>
                 <w:color w:val="FFFFFF"/>
                 <w:sz w:val="18"/>
@@ -683,7 +683,7 @@
             </w:pPr>
             <w:r>
               <w:rPr>
-                <w:rFonts w:ascii="Aptos" w:hAnsi="Aptos"/>
+                <w:rFonts w:ascii="Calibri" w:hAnsi="Calibri"/>
                 <w:b/>
                 <w:color w:val="FFFFFF"/>
                 <w:sz w:val="18"/>
@@ -701,7 +701,7 @@
           <w:p>
             <w:r>
               <w:rPr>
-                <w:rFonts w:ascii="Aptos" w:hAnsi="Aptos"/>
+                <w:rFonts w:ascii="Calibri" w:hAnsi="Calibri"/>
                 <w:color w:val="404040"/>
                 <w:sz w:val="17"/>
               </w:rPr>
@@ -716,7 +716,7 @@
           <w:p>
             <w:r>
               <w:rPr>
-                <w:rFonts w:ascii="Aptos" w:hAnsi="Aptos"/>
+                <w:rFonts w:ascii="Calibri" w:hAnsi="Calibri"/>
                 <w:color w:val="404040"/>
                 <w:sz w:val="17"/>
               </w:rPr>
@@ -733,7 +733,7 @@
           <w:p>
             <w:r>
               <w:rPr>
-                <w:rFonts w:ascii="Aptos" w:hAnsi="Aptos"/>
+                <w:rFonts w:ascii="Calibri" w:hAnsi="Calibri"/>
                 <w:color w:val="404040"/>
                 <w:sz w:val="17"/>
               </w:rPr>
@@ -748,7 +748,7 @@
           <w:p>
             <w:r>
               <w:rPr>
-                <w:rFonts w:ascii="Aptos" w:hAnsi="Aptos"/>
+                <w:rFonts w:ascii="Calibri" w:hAnsi="Calibri"/>
                 <w:color w:val="404040"/>
                 <w:sz w:val="17"/>
               </w:rPr>
@@ -765,7 +765,7 @@
           <w:p>
             <w:r>
               <w:rPr>
-                <w:rFonts w:ascii="Aptos" w:hAnsi="Aptos"/>
+                <w:rFonts w:ascii="Calibri" w:hAnsi="Calibri"/>
                 <w:color w:val="404040"/>
                 <w:sz w:val="17"/>
               </w:rPr>
@@ -780,7 +780,7 @@
           <w:p>
             <w:r>
               <w:rPr>
-                <w:rFonts w:ascii="Aptos" w:hAnsi="Aptos"/>
+                <w:rFonts w:ascii="Calibri" w:hAnsi="Calibri"/>
                 <w:color w:val="404040"/>
                 <w:sz w:val="17"/>
               </w:rPr>
@@ -797,7 +797,7 @@
           <w:p>
             <w:r>
               <w:rPr>
-                <w:rFonts w:ascii="Aptos" w:hAnsi="Aptos"/>
+                <w:rFonts w:ascii="Calibri" w:hAnsi="Calibri"/>
                 <w:color w:val="404040"/>
                 <w:sz w:val="17"/>
               </w:rPr>
@@ -812,7 +812,7 @@
           <w:p>
             <w:r>
               <w:rPr>
-                <w:rFonts w:ascii="Aptos" w:hAnsi="Aptos"/>
+                <w:rFonts w:ascii="Calibri" w:hAnsi="Calibri"/>
                 <w:color w:val="404040"/>
                 <w:sz w:val="17"/>
               </w:rPr>
@@ -829,7 +829,7 @@
           <w:p>
             <w:r>
               <w:rPr>
-                <w:rFonts w:ascii="Aptos" w:hAnsi="Aptos"/>
+                <w:rFonts w:ascii="Calibri" w:hAnsi="Calibri"/>
                 <w:color w:val="404040"/>
                 <w:sz w:val="17"/>
               </w:rPr>
@@ -844,7 +844,7 @@
           <w:p>
             <w:r>
               <w:rPr>
-                <w:rFonts w:ascii="Aptos" w:hAnsi="Aptos"/>
+                <w:rFonts w:ascii="Calibri" w:hAnsi="Calibri"/>
                 <w:color w:val="404040"/>
                 <w:sz w:val="17"/>
               </w:rPr>
@@ -865,7 +865,7 @@
       </w:pPr>
       <w:r>
         <w:rPr>
-          <w:rFonts w:ascii="Aptos" w:hAnsi="Aptos"/>
+          <w:rFonts w:ascii="Calibri" w:hAnsi="Calibri"/>
           <w:b w:val="0"/>
           <w:i w:val="0"/>
           <w:color w:val="404040"/>
@@ -881,7 +881,7 @@
       </w:pPr>
       <w:r>
         <w:rPr>
-          <w:rFonts w:ascii="Aptos" w:hAnsi="Aptos"/>
+          <w:rFonts w:ascii="Calibri" w:hAnsi="Calibri"/>
           <w:b/>
           <w:color w:val="16202A"/>
           <w:sz w:val="32"/>
@@ -895,7 +895,7 @@
       </w:pPr>
       <w:r>
         <w:rPr>
-          <w:rFonts w:ascii="Aptos" w:hAnsi="Aptos"/>
+          <w:rFonts w:ascii="Calibri" w:hAnsi="Calibri"/>
           <w:b w:val="0"/>
           <w:i w:val="0"/>
           <w:color w:val="404040"/>
@@ -911,7 +911,7 @@
       </w:pPr>
       <w:r>
         <w:rPr>
-          <w:rFonts w:ascii="Aptos" w:hAnsi="Aptos"/>
+          <w:rFonts w:ascii="Calibri" w:hAnsi="Calibri"/>
           <w:b/>
           <w:color w:val="16202A"/>
           <w:sz w:val="24"/>
@@ -926,7 +926,7 @@
       </w:pPr>
       <w:r>
         <w:rPr>
-          <w:rFonts w:ascii="Aptos" w:hAnsi="Aptos"/>
+          <w:rFonts w:ascii="Calibri" w:hAnsi="Calibri"/>
           <w:sz w:val="20"/>
         </w:rPr>
         <w:t>Hero: 'Rent Farm Equipment Near You' + search bar (Hero search â†’ equipment.html?search=) + 6 category cards (ðŸšœ Tractor, ðŸŒ¾ Harvester, ðŸŒ± Cultivator, ðŸŒ½ Seeder, ðŸ’§ Irrigation, ðŸ› ï¸ Other) â†’ filter by type</w:t>
@@ -939,7 +939,7 @@
       </w:pPr>
       <w:r>
         <w:rPr>
-          <w:rFonts w:ascii="Aptos" w:hAnsi="Aptos"/>
+          <w:rFonts w:ascii="Calibri" w:hAnsi="Calibri"/>
           <w:sz w:val="20"/>
         </w:rPr>
         <w:t>Popular: 6 equipment cards (image, name, type, owner, location, price/day, rating, Book Now)</w:t>
@@ -952,7 +952,7 @@
       </w:pPr>
       <w:r>
         <w:rPr>
-          <w:rFonts w:ascii="Aptos" w:hAnsi="Aptos"/>
+          <w:rFonts w:ascii="Calibri" w:hAnsi="Calibri"/>
           <w:sz w:val="20"/>
         </w:rPr>
         <w:t>Weather summary: Today's temperature, rain probability, 5-day mini forecast</w:t>
@@ -965,7 +965,7 @@
       </w:pPr>
       <w:r>
         <w:rPr>
-          <w:rFonts w:ascii="Aptos" w:hAnsi="Aptos"/>
+          <w:rFonts w:ascii="Calibri" w:hAnsi="Calibri"/>
           <w:sz w:val="20"/>
         </w:rPr>
         <w:t>How-it-works: 3 steps (Search â†’ Select Dates â†’ Book) + Benefits (Save 70%, Earn from idle, Verified) + CTA 'List Your Equipment'</w:t>
@@ -978,7 +978,7 @@
       </w:pPr>
       <w:r>
         <w:rPr>
-          <w:rFonts w:ascii="Aptos" w:hAnsi="Aptos"/>
+          <w:rFonts w:ascii="Calibri" w:hAnsi="Calibri"/>
           <w:b/>
           <w:color w:val="16202A"/>
           <w:sz w:val="24"/>
@@ -993,7 +993,7 @@
       </w:pPr>
       <w:r>
         <w:rPr>
-          <w:rFonts w:ascii="Aptos" w:hAnsi="Aptos"/>
+          <w:rFonts w:ascii="Calibri" w:hAnsi="Calibri"/>
           <w:sz w:val="20"/>
         </w:rPr>
         <w:t>equipment.html: Search input, filters (category, location, price 0-1000/1000-2000/2000-4000/4000+, availability, sort price low-high/high-low/rating) â†’ grid of cards â†’ Book Now / View Details</w:t>
@@ -1006,7 +1006,7 @@
       </w:pPr>
       <w:r>
         <w:rPr>
-          <w:rFonts w:ascii="Aptos" w:hAnsi="Aptos"/>
+          <w:rFonts w:ascii="Calibri" w:hAnsi="Calibri"/>
           <w:sz w:val="20"/>
         </w:rPr>
         <w:t>equipment-details.html: Large photo, price â‚¹2,500/day, rating, description, owner/location, specs, calendar, booking summary (dates/duration/total + price/day), Book Now â†’ booking.html?id=, reviews</w:t>
@@ -1019,7 +1019,7 @@
       </w:pPr>
       <w:r>
         <w:rPr>
-          <w:rFonts w:ascii="Aptos" w:hAnsi="Aptos"/>
+          <w:rFonts w:ascii="Calibri" w:hAnsi="Calibri"/>
           <w:b/>
           <w:color w:val="16202A"/>
           <w:sz w:val="24"/>
@@ -1034,7 +1034,7 @@
       </w:pPr>
       <w:r>
         <w:rPr>
-          <w:rFonts w:ascii="Aptos" w:hAnsi="Aptos"/>
+          <w:rFonts w:ascii="Calibri" w:hAnsi="Calibri"/>
           <w:sz w:val="20"/>
         </w:rPr>
         <w:t>booking.html: Left: equipment summary + price/day, interactive calendar, weather recommendation box; Right: Booking summary (Start, End, Duration, Total) + Formula 'Total = Days Ã— Price' + Confirm Booking (handles 409 overlap error)</w:t>
@@ -1047,7 +1047,7 @@
       </w:pPr>
       <w:r>
         <w:rPr>
-          <w:rFonts w:ascii="Aptos" w:hAnsi="Aptos"/>
+          <w:rFonts w:ascii="Calibri" w:hAnsi="Calibri"/>
           <w:sz w:val="20"/>
         </w:rPr>
         <w:t>Dashboard: Namaste, Farmer + 3 stats (My Equipment, Active Bookings, Earnings â‚¹), weather 28Â°C, recent bookings, my equipment grid</w:t>
@@ -1060,7 +1060,7 @@
       </w:pPr>
       <w:r>
         <w:rPr>
-          <w:rFonts w:ascii="Aptos" w:hAnsi="Aptos"/>
+          <w:rFonts w:ascii="Calibri" w:hAnsi="Calibri"/>
           <w:sz w:val="20"/>
         </w:rPr>
         <w:t>List Equipment: Form (name, category, description, price, location, image URL, availability) â†’ POST /api/equipment â†’ appears instantly</w:t>
@@ -1073,7 +1073,7 @@
       </w:pPr>
       <w:r>
         <w:rPr>
-          <w:rFonts w:ascii="Aptos" w:hAnsi="Aptos"/>
+          <w:rFonts w:ascii="Calibri" w:hAnsi="Calibri"/>
           <w:sz w:val="20"/>
         </w:rPr>
         <w:t>My Bookings: Tabs (All / My Rentals / Incoming Requests), cards with equipment, dates, days, amount, status badges (Pending/Confirmed/Completed/Cancelled), Cancel/Complete</w:t>
@@ -1086,7 +1086,7 @@
       </w:pPr>
       <w:r>
         <w:rPr>
-          <w:rFonts w:ascii="Aptos" w:hAnsi="Aptos"/>
+          <w:rFonts w:ascii="Calibri" w:hAnsi="Calibri"/>
           <w:sz w:val="20"/>
         </w:rPr>
         <w:t>Weather, Profile, Login/Register: Weather with location/type/date â†’ current + rec + 5-day; Profile view/edit lang; Auth forms with demo accounts hint</w:t>
@@ -1098,7 +1098,7 @@
       </w:pPr>
       <w:r>
         <w:rPr>
-          <w:rFonts w:ascii="Aptos" w:hAnsi="Aptos"/>
+          <w:rFonts w:ascii="Calibri" w:hAnsi="Calibri"/>
           <w:b w:val="0"/>
           <w:i w:val="0"/>
           <w:color w:val="404040"/>
@@ -1114,7 +1114,7 @@
       </w:pPr>
       <w:r>
         <w:rPr>
-          <w:rFonts w:ascii="Aptos" w:hAnsi="Aptos"/>
+          <w:rFonts w:ascii="Calibri" w:hAnsi="Calibri"/>
           <w:b/>
           <w:color w:val="16202A"/>
           <w:sz w:val="32"/>
@@ -1128,7 +1128,7 @@
       </w:pPr>
       <w:r>
         <w:rPr>
-          <w:rFonts w:ascii="Aptos" w:hAnsi="Aptos"/>
+          <w:rFonts w:ascii="Calibri" w:hAnsi="Calibri"/>
           <w:b w:val="0"/>
           <w:i w:val="0"/>
           <w:color w:val="404040"/>
@@ -1160,7 +1160,7 @@
       </w:pPr>
       <w:r>
         <w:rPr>
-          <w:rFonts w:ascii="Aptos" w:hAnsi="Aptos"/>
+          <w:rFonts w:ascii="Calibri" w:hAnsi="Calibri"/>
           <w:b/>
           <w:color w:val="16202A"/>
           <w:sz w:val="24"/>
@@ -1175,7 +1175,7 @@
       </w:pPr>
       <w:r>
         <w:rPr>
-          <w:rFonts w:ascii="Aptos" w:hAnsi="Aptos"/>
+          <w:rFonts w:ascii="Calibri" w:hAnsi="Calibri"/>
           <w:sz w:val="20"/>
         </w:rPr>
         <w:t>Express creates app, chooses PORT 3000 unless PORT env is set.</w:t>
@@ -1188,7 +1188,7 @@
       </w:pPr>
       <w:r>
         <w:rPr>
-          <w:rFonts w:ascii="Aptos" w:hAnsi="Aptos"/>
+          <w:rFonts w:ascii="Calibri" w:hAnsi="Calibri"/>
           <w:sz w:val="20"/>
         </w:rPr>
         <w:t>Server creates database directory if not exists.</w:t>
@@ -1201,7 +1201,7 @@
       </w:pPr>
       <w:r>
         <w:rPr>
-          <w:rFonts w:ascii="Aptos" w:hAnsi="Aptos"/>
+          <w:rFonts w:ascii="Calibri" w:hAnsi="Calibri"/>
           <w:sz w:val="20"/>
         </w:rPr>
         <w:t>sqlite3 opens database/krishi.db (or /tmp/krishi.db on Vercel when VERCEL env true).</w:t>
@@ -1214,7 +1214,7 @@
       </w:pPr>
       <w:r>
         <w:rPr>
-          <w:rFonts w:ascii="Aptos" w:hAnsi="Aptos"/>
+          <w:rFonts w:ascii="Calibri" w:hAnsi="Calibri"/>
           <w:sz w:val="20"/>
         </w:rPr>
         <w:t>PRAGMA foreign_keys = ON and WAL mode are set.</w:t>
@@ -1227,7 +1227,7 @@
       </w:pPr>
       <w:r>
         <w:rPr>
-          <w:rFonts w:ascii="Aptos" w:hAnsi="Aptos"/>
+          <w:rFonts w:ascii="Calibri" w:hAnsi="Calibri"/>
           <w:sz w:val="20"/>
         </w:rPr>
         <w:t>schema.sql creates users, equipment, bookings, reviews with indexes and checks.</w:t>
@@ -1240,7 +1240,7 @@
       </w:pPr>
       <w:r>
         <w:rPr>
-          <w:rFonts w:ascii="Aptos" w:hAnsi="Aptos"/>
+          <w:rFonts w:ascii="Calibri" w:hAnsi="Calibri"/>
           <w:sz w:val="20"/>
         </w:rPr>
         <w:t>Seed inserts 3 demo users (hashed password123) and 11 equipment only when users=0.</w:t>
@@ -1253,7 +1253,7 @@
       </w:pPr>
       <w:r>
         <w:rPr>
-          <w:rFonts w:ascii="Aptos" w:hAnsi="Aptos"/>
+          <w:rFonts w:ascii="Calibri" w:hAnsi="Calibri"/>
           <w:sz w:val="20"/>
         </w:rPr>
         <w:t>express.json parses JSON, express.static serves frontend folder.</w:t>
@@ -1266,7 +1266,7 @@
       </w:pPr>
       <w:r>
         <w:rPr>
-          <w:rFonts w:ascii="Aptos" w:hAnsi="Aptos"/>
+          <w:rFonts w:ascii="Calibri" w:hAnsi="Calibri"/>
           <w:sz w:val="20"/>
         </w:rPr>
         <w:t>Server listens on 0.0.0.0:3000 (or conditional listen when required as module for Vercel).</w:t>
@@ -1279,7 +1279,7 @@
       </w:pPr>
       <w:r>
         <w:rPr>
-          <w:rFonts w:ascii="Aptos" w:hAnsi="Aptos"/>
+          <w:rFonts w:ascii="Calibri" w:hAnsi="Calibri"/>
           <w:b/>
           <w:color w:val="16202A"/>
           <w:sz w:val="24"/>
@@ -1294,7 +1294,7 @@
       </w:pPr>
       <w:r>
         <w:rPr>
-          <w:rFonts w:ascii="Aptos" w:hAnsi="Aptos"/>
+          <w:rFonts w:ascii="Calibri" w:hAnsi="Calibri"/>
           <w:sz w:val="20"/>
         </w:rPr>
         <w:t>Browser collects equipment_id, start_date, end_date from calendar (getSelectedDates()).</w:t>
@@ -1307,7 +1307,7 @@
       </w:pPr>
       <w:r>
         <w:rPr>
-          <w:rFonts w:ascii="Aptos" w:hAnsi="Aptos"/>
+          <w:rFonts w:ascii="Calibri" w:hAnsi="Calibri"/>
           <w:sz w:val="20"/>
         </w:rPr>
         <w:t>It sends POST /api/bookings with Bearer JWT and JSON body.</w:t>
@@ -1320,7 +1320,7 @@
       </w:pPr>
       <w:r>
         <w:rPr>
-          <w:rFonts w:ascii="Aptos" w:hAnsi="Aptos"/>
+          <w:rFonts w:ascii="Calibri" w:hAnsi="Calibri"/>
           <w:sz w:val="20"/>
         </w:rPr>
         <w:t>Express verifies JWT via auth middleware (401 if missing/invalid).</w:t>
@@ -1333,7 +1333,7 @@
       </w:pPr>
       <w:r>
         <w:rPr>
-          <w:rFonts w:ascii="Aptos" w:hAnsi="Aptos"/>
+          <w:rFonts w:ascii="Calibri" w:hAnsi="Calibri"/>
           <w:sz w:val="20"/>
         </w:rPr>
         <w:t>Server validates: equipment exists, availability='available', renter â‰  owner, date format, end &gt;= start.</w:t>
@@ -1346,7 +1346,7 @@
       </w:pPr>
       <w:r>
         <w:rPr>
-          <w:rFonts w:ascii="Aptos" w:hAnsi="Aptos"/>
+          <w:rFonts w:ascii="Calibri" w:hAnsi="Calibri"/>
           <w:sz w:val="20"/>
         </w:rPr>
         <w:t>Double-booking SQL: SELECT COUNT(*) FROM bookings WHERE equipment_id=? AND status IN ('confirmed','pending') AND date(?) &lt;= date(end_date) AND date(?) &gt;= date(start_date). If &gt;0 â†’ 409.</w:t>
@@ -1359,7 +1359,7 @@
       </w:pPr>
       <w:r>
         <w:rPr>
-          <w:rFonts w:ascii="Aptos" w:hAnsi="Aptos"/>
+          <w:rFonts w:ascii="Calibri" w:hAnsi="Calibri"/>
           <w:sz w:val="20"/>
         </w:rPr>
         <w:t>Days = ceil((end-start)/ms)+1 inclusive, total = days Ã— price_per_day.</w:t>
@@ -1372,7 +1372,7 @@
       </w:pPr>
       <w:r>
         <w:rPr>
-          <w:rFonts w:ascii="Aptos" w:hAnsi="Aptos"/>
+          <w:rFonts w:ascii="Calibri" w:hAnsi="Calibri"/>
           <w:sz w:val="20"/>
         </w:rPr>
         <w:t>SQLite INSERT bookings and return booking with JOIN equipment name.</w:t>
@@ -1385,7 +1385,7 @@
       </w:pPr>
       <w:r>
         <w:rPr>
-          <w:rFonts w:ascii="Aptos" w:hAnsi="Aptos"/>
+          <w:rFonts w:ascii="Calibri" w:hAnsi="Calibri"/>
           <w:sz w:val="20"/>
         </w:rPr>
         <w:t>Browser shows 'Booking confirmed' and redirects to my-bookings.html.</w:t>
@@ -1397,7 +1397,7 @@
       </w:pPr>
       <w:r>
         <w:rPr>
-          <w:rFonts w:ascii="Aptos" w:hAnsi="Aptos"/>
+          <w:rFonts w:ascii="Calibri" w:hAnsi="Calibri"/>
           <w:b w:val="0"/>
           <w:i w:val="0"/>
           <w:color w:val="404040"/>
@@ -1413,7 +1413,7 @@
       </w:pPr>
       <w:r>
         <w:rPr>
-          <w:rFonts w:ascii="Aptos" w:hAnsi="Aptos"/>
+          <w:rFonts w:ascii="Calibri" w:hAnsi="Calibri"/>
           <w:b/>
           <w:color w:val="16202A"/>
           <w:sz w:val="32"/>
@@ -1427,7 +1427,7 @@
       </w:pPr>
       <w:r>
         <w:rPr>
-          <w:rFonts w:ascii="Aptos" w:hAnsi="Aptos"/>
+          <w:rFonts w:ascii="Calibri" w:hAnsi="Calibri"/>
           <w:b w:val="0"/>
           <w:i w:val="0"/>
           <w:color w:val="404040"/>
@@ -1461,7 +1461,7 @@
             </w:pPr>
             <w:r>
               <w:rPr>
-                <w:rFonts w:ascii="Aptos" w:hAnsi="Aptos"/>
+                <w:rFonts w:ascii="Calibri" w:hAnsi="Calibri"/>
                 <w:b/>
                 <w:color w:val="FFFFFF"/>
                 <w:sz w:val="18"/>
@@ -1481,7 +1481,7 @@
             </w:pPr>
             <w:r>
               <w:rPr>
-                <w:rFonts w:ascii="Aptos" w:hAnsi="Aptos"/>
+                <w:rFonts w:ascii="Calibri" w:hAnsi="Calibri"/>
                 <w:b/>
                 <w:color w:val="FFFFFF"/>
                 <w:sz w:val="18"/>
@@ -1501,7 +1501,7 @@
             </w:pPr>
             <w:r>
               <w:rPr>
-                <w:rFonts w:ascii="Aptos" w:hAnsi="Aptos"/>
+                <w:rFonts w:ascii="Calibri" w:hAnsi="Calibri"/>
                 <w:b/>
                 <w:color w:val="FFFFFF"/>
                 <w:sz w:val="18"/>
@@ -1519,7 +1519,7 @@
           <w:p>
             <w:r>
               <w:rPr>
-                <w:rFonts w:ascii="Aptos" w:hAnsi="Aptos"/>
+                <w:rFonts w:ascii="Calibri" w:hAnsi="Calibri"/>
                 <w:color w:val="404040"/>
                 <w:sz w:val="17"/>
               </w:rPr>
@@ -1534,7 +1534,7 @@
           <w:p>
             <w:r>
               <w:rPr>
-                <w:rFonts w:ascii="Aptos" w:hAnsi="Aptos"/>
+                <w:rFonts w:ascii="Calibri" w:hAnsi="Calibri"/>
                 <w:color w:val="404040"/>
                 <w:sz w:val="17"/>
               </w:rPr>
@@ -1549,7 +1549,7 @@
           <w:p>
             <w:r>
               <w:rPr>
-                <w:rFonts w:ascii="Aptos" w:hAnsi="Aptos"/>
+                <w:rFonts w:ascii="Calibri" w:hAnsi="Calibri"/>
                 <w:color w:val="404040"/>
                 <w:sz w:val="17"/>
               </w:rPr>
@@ -1566,7 +1566,7 @@
           <w:p>
             <w:r>
               <w:rPr>
-                <w:rFonts w:ascii="Aptos" w:hAnsi="Aptos"/>
+                <w:rFonts w:ascii="Calibri" w:hAnsi="Calibri"/>
                 <w:color w:val="404040"/>
                 <w:sz w:val="17"/>
               </w:rPr>
@@ -1581,7 +1581,7 @@
           <w:p>
             <w:r>
               <w:rPr>
-                <w:rFonts w:ascii="Aptos" w:hAnsi="Aptos"/>
+                <w:rFonts w:ascii="Calibri" w:hAnsi="Calibri"/>
                 <w:color w:val="404040"/>
                 <w:sz w:val="17"/>
               </w:rPr>
@@ -1596,7 +1596,7 @@
           <w:p>
             <w:r>
               <w:rPr>
-                <w:rFonts w:ascii="Aptos" w:hAnsi="Aptos"/>
+                <w:rFonts w:ascii="Calibri" w:hAnsi="Calibri"/>
                 <w:color w:val="404040"/>
                 <w:sz w:val="17"/>
               </w:rPr>
@@ -1613,7 +1613,7 @@
           <w:p>
             <w:r>
               <w:rPr>
-                <w:rFonts w:ascii="Aptos" w:hAnsi="Aptos"/>
+                <w:rFonts w:ascii="Calibri" w:hAnsi="Calibri"/>
                 <w:color w:val="404040"/>
                 <w:sz w:val="17"/>
               </w:rPr>
@@ -1628,7 +1628,7 @@
           <w:p>
             <w:r>
               <w:rPr>
-                <w:rFonts w:ascii="Aptos" w:hAnsi="Aptos"/>
+                <w:rFonts w:ascii="Calibri" w:hAnsi="Calibri"/>
                 <w:color w:val="404040"/>
                 <w:sz w:val="17"/>
               </w:rPr>
@@ -1643,7 +1643,7 @@
           <w:p>
             <w:r>
               <w:rPr>
-                <w:rFonts w:ascii="Aptos" w:hAnsi="Aptos"/>
+                <w:rFonts w:ascii="Calibri" w:hAnsi="Calibri"/>
                 <w:color w:val="404040"/>
                 <w:sz w:val="17"/>
               </w:rPr>
@@ -1660,7 +1660,7 @@
           <w:p>
             <w:r>
               <w:rPr>
-                <w:rFonts w:ascii="Aptos" w:hAnsi="Aptos"/>
+                <w:rFonts w:ascii="Calibri" w:hAnsi="Calibri"/>
                 <w:color w:val="404040"/>
                 <w:sz w:val="17"/>
               </w:rPr>
@@ -1675,7 +1675,7 @@
           <w:p>
             <w:r>
               <w:rPr>
-                <w:rFonts w:ascii="Aptos" w:hAnsi="Aptos"/>
+                <w:rFonts w:ascii="Calibri" w:hAnsi="Calibri"/>
                 <w:color w:val="404040"/>
                 <w:sz w:val="17"/>
               </w:rPr>
@@ -1690,7 +1690,7 @@
           <w:p>
             <w:r>
               <w:rPr>
-                <w:rFonts w:ascii="Aptos" w:hAnsi="Aptos"/>
+                <w:rFonts w:ascii="Calibri" w:hAnsi="Calibri"/>
                 <w:color w:val="404040"/>
                 <w:sz w:val="17"/>
               </w:rPr>
@@ -1707,7 +1707,7 @@
           <w:p>
             <w:r>
               <w:rPr>
-                <w:rFonts w:ascii="Aptos" w:hAnsi="Aptos"/>
+                <w:rFonts w:ascii="Calibri" w:hAnsi="Calibri"/>
                 <w:color w:val="404040"/>
                 <w:sz w:val="17"/>
               </w:rPr>
@@ -1722,7 +1722,7 @@
           <w:p>
             <w:r>
               <w:rPr>
-                <w:rFonts w:ascii="Aptos" w:hAnsi="Aptos"/>
+                <w:rFonts w:ascii="Calibri" w:hAnsi="Calibri"/>
                 <w:color w:val="404040"/>
                 <w:sz w:val="17"/>
               </w:rPr>
@@ -1737,7 +1737,7 @@
           <w:p>
             <w:r>
               <w:rPr>
-                <w:rFonts w:ascii="Aptos" w:hAnsi="Aptos"/>
+                <w:rFonts w:ascii="Calibri" w:hAnsi="Calibri"/>
                 <w:color w:val="404040"/>
                 <w:sz w:val="17"/>
               </w:rPr>
@@ -1754,7 +1754,7 @@
           <w:p>
             <w:r>
               <w:rPr>
-                <w:rFonts w:ascii="Aptos" w:hAnsi="Aptos"/>
+                <w:rFonts w:ascii="Calibri" w:hAnsi="Calibri"/>
                 <w:color w:val="404040"/>
                 <w:sz w:val="17"/>
               </w:rPr>
@@ -1769,7 +1769,7 @@
           <w:p>
             <w:r>
               <w:rPr>
-                <w:rFonts w:ascii="Aptos" w:hAnsi="Aptos"/>
+                <w:rFonts w:ascii="Calibri" w:hAnsi="Calibri"/>
                 <w:color w:val="404040"/>
                 <w:sz w:val="17"/>
               </w:rPr>
@@ -1784,7 +1784,7 @@
           <w:p>
             <w:r>
               <w:rPr>
-                <w:rFonts w:ascii="Aptos" w:hAnsi="Aptos"/>
+                <w:rFonts w:ascii="Calibri" w:hAnsi="Calibri"/>
                 <w:color w:val="404040"/>
                 <w:sz w:val="17"/>
               </w:rPr>
@@ -1801,7 +1801,7 @@
           <w:p>
             <w:r>
               <w:rPr>
-                <w:rFonts w:ascii="Aptos" w:hAnsi="Aptos"/>
+                <w:rFonts w:ascii="Calibri" w:hAnsi="Calibri"/>
                 <w:color w:val="404040"/>
                 <w:sz w:val="17"/>
               </w:rPr>
@@ -1816,7 +1816,7 @@
           <w:p>
             <w:r>
               <w:rPr>
-                <w:rFonts w:ascii="Aptos" w:hAnsi="Aptos"/>
+                <w:rFonts w:ascii="Calibri" w:hAnsi="Calibri"/>
                 <w:color w:val="404040"/>
                 <w:sz w:val="17"/>
               </w:rPr>
@@ -1831,7 +1831,7 @@
           <w:p>
             <w:r>
               <w:rPr>
-                <w:rFonts w:ascii="Aptos" w:hAnsi="Aptos"/>
+                <w:rFonts w:ascii="Calibri" w:hAnsi="Calibri"/>
                 <w:color w:val="404040"/>
                 <w:sz w:val="17"/>
               </w:rPr>
@@ -1848,7 +1848,7 @@
           <w:p>
             <w:r>
               <w:rPr>
-                <w:rFonts w:ascii="Aptos" w:hAnsi="Aptos"/>
+                <w:rFonts w:ascii="Calibri" w:hAnsi="Calibri"/>
                 <w:color w:val="404040"/>
                 <w:sz w:val="17"/>
               </w:rPr>
@@ -1863,7 +1863,7 @@
           <w:p>
             <w:r>
               <w:rPr>
-                <w:rFonts w:ascii="Aptos" w:hAnsi="Aptos"/>
+                <w:rFonts w:ascii="Calibri" w:hAnsi="Calibri"/>
                 <w:color w:val="404040"/>
                 <w:sz w:val="17"/>
               </w:rPr>
@@ -1878,7 +1878,7 @@
           <w:p>
             <w:r>
               <w:rPr>
-                <w:rFonts w:ascii="Aptos" w:hAnsi="Aptos"/>
+                <w:rFonts w:ascii="Calibri" w:hAnsi="Calibri"/>
                 <w:color w:val="404040"/>
                 <w:sz w:val="17"/>
               </w:rPr>
@@ -1895,7 +1895,7 @@
           <w:p>
             <w:r>
               <w:rPr>
-                <w:rFonts w:ascii="Aptos" w:hAnsi="Aptos"/>
+                <w:rFonts w:ascii="Calibri" w:hAnsi="Calibri"/>
                 <w:color w:val="404040"/>
                 <w:sz w:val="17"/>
               </w:rPr>
@@ -1910,7 +1910,7 @@
           <w:p>
             <w:r>
               <w:rPr>
-                <w:rFonts w:ascii="Aptos" w:hAnsi="Aptos"/>
+                <w:rFonts w:ascii="Calibri" w:hAnsi="Calibri"/>
                 <w:color w:val="404040"/>
                 <w:sz w:val="17"/>
               </w:rPr>
@@ -1925,7 +1925,7 @@
           <w:p>
             <w:r>
               <w:rPr>
-                <w:rFonts w:ascii="Aptos" w:hAnsi="Aptos"/>
+                <w:rFonts w:ascii="Calibri" w:hAnsi="Calibri"/>
                 <w:color w:val="404040"/>
                 <w:sz w:val="17"/>
               </w:rPr>
@@ -1942,7 +1942,7 @@
           <w:p>
             <w:r>
               <w:rPr>
-                <w:rFonts w:ascii="Aptos" w:hAnsi="Aptos"/>
+                <w:rFonts w:ascii="Calibri" w:hAnsi="Calibri"/>
                 <w:color w:val="404040"/>
                 <w:sz w:val="17"/>
               </w:rPr>
@@ -1957,7 +1957,7 @@
           <w:p>
             <w:r>
               <w:rPr>
-                <w:rFonts w:ascii="Aptos" w:hAnsi="Aptos"/>
+                <w:rFonts w:ascii="Calibri" w:hAnsi="Calibri"/>
                 <w:color w:val="404040"/>
                 <w:sz w:val="17"/>
               </w:rPr>
@@ -1972,7 +1972,7 @@
           <w:p>
             <w:r>
               <w:rPr>
-                <w:rFonts w:ascii="Aptos" w:hAnsi="Aptos"/>
+                <w:rFonts w:ascii="Calibri" w:hAnsi="Calibri"/>
                 <w:color w:val="404040"/>
                 <w:sz w:val="17"/>
               </w:rPr>
@@ -1989,7 +1989,7 @@
           <w:p>
             <w:r>
               <w:rPr>
-                <w:rFonts w:ascii="Aptos" w:hAnsi="Aptos"/>
+                <w:rFonts w:ascii="Calibri" w:hAnsi="Calibri"/>
                 <w:color w:val="404040"/>
                 <w:sz w:val="17"/>
               </w:rPr>
@@ -2004,7 +2004,7 @@
           <w:p>
             <w:r>
               <w:rPr>
-                <w:rFonts w:ascii="Aptos" w:hAnsi="Aptos"/>
+                <w:rFonts w:ascii="Calibri" w:hAnsi="Calibri"/>
                 <w:color w:val="404040"/>
                 <w:sz w:val="17"/>
               </w:rPr>
@@ -2019,7 +2019,7 @@
           <w:p>
             <w:r>
               <w:rPr>
-                <w:rFonts w:ascii="Aptos" w:hAnsi="Aptos"/>
+                <w:rFonts w:ascii="Calibri" w:hAnsi="Calibri"/>
                 <w:color w:val="404040"/>
                 <w:sz w:val="17"/>
               </w:rPr>
@@ -2036,7 +2036,7 @@
           <w:p>
             <w:r>
               <w:rPr>
-                <w:rFonts w:ascii="Aptos" w:hAnsi="Aptos"/>
+                <w:rFonts w:ascii="Calibri" w:hAnsi="Calibri"/>
                 <w:color w:val="404040"/>
                 <w:sz w:val="17"/>
               </w:rPr>
@@ -2051,7 +2051,7 @@
           <w:p>
             <w:r>
               <w:rPr>
-                <w:rFonts w:ascii="Aptos" w:hAnsi="Aptos"/>
+                <w:rFonts w:ascii="Calibri" w:hAnsi="Calibri"/>
                 <w:color w:val="404040"/>
                 <w:sz w:val="17"/>
               </w:rPr>
@@ -2066,7 +2066,7 @@
           <w:p>
             <w:r>
               <w:rPr>
-                <w:rFonts w:ascii="Aptos" w:hAnsi="Aptos"/>
+                <w:rFonts w:ascii="Calibri" w:hAnsi="Calibri"/>
                 <w:color w:val="404040"/>
                 <w:sz w:val="17"/>
               </w:rPr>
@@ -2083,7 +2083,7 @@
           <w:p>
             <w:r>
               <w:rPr>
-                <w:rFonts w:ascii="Aptos" w:hAnsi="Aptos"/>
+                <w:rFonts w:ascii="Calibri" w:hAnsi="Calibri"/>
                 <w:color w:val="404040"/>
                 <w:sz w:val="17"/>
               </w:rPr>
@@ -2098,7 +2098,7 @@
           <w:p>
             <w:r>
               <w:rPr>
-                <w:rFonts w:ascii="Aptos" w:hAnsi="Aptos"/>
+                <w:rFonts w:ascii="Calibri" w:hAnsi="Calibri"/>
                 <w:color w:val="404040"/>
                 <w:sz w:val="17"/>
               </w:rPr>
@@ -2113,7 +2113,7 @@
           <w:p>
             <w:r>
               <w:rPr>
-                <w:rFonts w:ascii="Aptos" w:hAnsi="Aptos"/>
+                <w:rFonts w:ascii="Calibri" w:hAnsi="Calibri"/>
                 <w:color w:val="404040"/>
                 <w:sz w:val="17"/>
               </w:rPr>
@@ -2134,7 +2134,7 @@
       </w:pPr>
       <w:r>
         <w:rPr>
-          <w:rFonts w:ascii="Aptos" w:hAnsi="Aptos"/>
+          <w:rFonts w:ascii="Calibri" w:hAnsi="Calibri"/>
           <w:b w:val="0"/>
           <w:i/>
           <w:color w:val="404040"/>
@@ -2150,7 +2150,7 @@
       </w:pPr>
       <w:r>
         <w:rPr>
-          <w:rFonts w:ascii="Aptos" w:hAnsi="Aptos"/>
+          <w:rFonts w:ascii="Calibri" w:hAnsi="Calibri"/>
           <w:b/>
           <w:color w:val="16202A"/>
           <w:sz w:val="24"/>
@@ -2165,7 +2165,7 @@
       </w:pPr>
       <w:r>
         <w:rPr>
-          <w:rFonts w:ascii="Aptos" w:hAnsi="Aptos"/>
+          <w:rFonts w:ascii="Calibri" w:hAnsi="Calibri"/>
           <w:sz w:val="20"/>
         </w:rPr>
         <w:t>HTML provides semantic header, nav, main, section, table, form, label, input, select, textarea</w:t>
@@ -2178,7 +2178,7 @@
       </w:pPr>
       <w:r>
         <w:rPr>
-          <w:rFonts w:ascii="Aptos" w:hAnsi="Aptos"/>
+          <w:rFonts w:ascii="Calibri" w:hAnsi="Calibri"/>
           <w:sz w:val="20"/>
         </w:rPr>
         <w:t>CSS uses custom properties (--primary, --ink), Grid/Flex for layout, card, progress, score, media queries</w:t>
@@ -2191,7 +2191,7 @@
       </w:pPr>
       <w:r>
         <w:rPr>
-          <w:rFonts w:ascii="Aptos" w:hAnsi="Aptos"/>
+          <w:rFonts w:ascii="Calibri" w:hAnsi="Calibri"/>
           <w:sz w:val="20"/>
         </w:rPr>
         <w:t>Vanilla JS: fetch wrapper apiFetch() checks status, renderSummary() updates dashboard, calendar.js controls month nav and selection, escapeHtml() prevents XSS</w:t>
@@ -2204,7 +2204,7 @@
       </w:pPr>
       <w:r>
         <w:rPr>
-          <w:rFonts w:ascii="Aptos" w:hAnsi="Aptos"/>
+          <w:rFonts w:ascii="Calibri" w:hAnsi="Calibri"/>
           <w:sz w:val="20"/>
         </w:rPr>
         <w:t>Provides form controls for equipment and bookings and accessibility via labels and aria-label</w:t>
@@ -2217,7 +2217,7 @@
       </w:pPr>
       <w:r>
         <w:rPr>
-          <w:rFonts w:ascii="Aptos" w:hAnsi="Aptos"/>
+          <w:rFonts w:ascii="Calibri" w:hAnsi="Calibri"/>
           <w:b/>
           <w:color w:val="16202A"/>
           <w:sz w:val="24"/>
@@ -2232,7 +2232,7 @@
       </w:pPr>
       <w:r>
         <w:rPr>
-          <w:rFonts w:ascii="Aptos" w:hAnsi="Aptos"/>
+          <w:rFonts w:ascii="Calibri" w:hAnsi="Calibri"/>
           <w:sz w:val="20"/>
         </w:rPr>
         <w:t>Node runs JS server, Express defines routes (app.get/post/put/delete), middleware (cors, json, static), error handlers</w:t>
@@ -2245,7 +2245,7 @@
       </w:pPr>
       <w:r>
         <w:rPr>
-          <w:rFonts w:ascii="Aptos" w:hAnsi="Aptos"/>
+          <w:rFonts w:ascii="Calibri" w:hAnsi="Calibri"/>
           <w:sz w:val="20"/>
         </w:rPr>
         <w:t>SQLite persists state, prepared statements with ? placeholders, PRAGMA foreign_keys ON, indexes for search/overlap queries</w:t>
@@ -2258,7 +2258,7 @@
       </w:pPr>
       <w:r>
         <w:rPr>
-          <w:rFonts w:ascii="Aptos" w:hAnsi="Aptos"/>
+          <w:rFonts w:ascii="Calibri" w:hAnsi="Calibri"/>
           <w:sz w:val="20"/>
         </w:rPr>
         <w:t>sqlite3 provides Database, run/get/all with callbacks wrapped in Promises (runAsync/getAsync/allAsync)</w:t>
@@ -2271,7 +2271,7 @@
       </w:pPr>
       <w:r>
         <w:rPr>
-          <w:rFonts w:ascii="Aptos" w:hAnsi="Aptos"/>
+          <w:rFonts w:ascii="Calibri" w:hAnsi="Calibri"/>
           <w:b/>
           <w:color w:val="16202A"/>
           <w:sz w:val="32"/>
@@ -2286,7 +2286,7 @@
       </w:pPr>
       <w:r>
         <w:rPr>
-          <w:rFonts w:ascii="Aptos" w:hAnsi="Aptos"/>
+          <w:rFonts w:ascii="Calibri" w:hAnsi="Calibri"/>
           <w:b/>
           <w:color w:val="16202A"/>
           <w:sz w:val="24"/>
@@ -2318,7 +2318,7 @@
             </w:pPr>
             <w:r>
               <w:rPr>
-                <w:rFonts w:ascii="Aptos" w:hAnsi="Aptos"/>
+                <w:rFonts w:ascii="Calibri" w:hAnsi="Calibri"/>
                 <w:b/>
                 <w:color w:val="FFFFFF"/>
                 <w:sz w:val="18"/>
@@ -2338,7 +2338,7 @@
             </w:pPr>
             <w:r>
               <w:rPr>
-                <w:rFonts w:ascii="Aptos" w:hAnsi="Aptos"/>
+                <w:rFonts w:ascii="Calibri" w:hAnsi="Calibri"/>
                 <w:b/>
                 <w:color w:val="FFFFFF"/>
                 <w:sz w:val="18"/>
@@ -2356,7 +2356,7 @@
           <w:p>
             <w:r>
               <w:rPr>
-                <w:rFonts w:ascii="Aptos" w:hAnsi="Aptos"/>
+                <w:rFonts w:ascii="Calibri" w:hAnsi="Calibri"/>
                 <w:color w:val="404040"/>
                 <w:sz w:val="17"/>
               </w:rPr>
@@ -2371,7 +2371,7 @@
           <w:p>
             <w:r>
               <w:rPr>
-                <w:rFonts w:ascii="Aptos" w:hAnsi="Aptos"/>
+                <w:rFonts w:ascii="Calibri" w:hAnsi="Calibri"/>
                 <w:color w:val="404040"/>
                 <w:sz w:val="17"/>
               </w:rPr>
@@ -2388,7 +2388,7 @@
           <w:p>
             <w:r>
               <w:rPr>
-                <w:rFonts w:ascii="Aptos" w:hAnsi="Aptos"/>
+                <w:rFonts w:ascii="Calibri" w:hAnsi="Calibri"/>
                 <w:color w:val="404040"/>
                 <w:sz w:val="17"/>
               </w:rPr>
@@ -2403,7 +2403,7 @@
           <w:p>
             <w:r>
               <w:rPr>
-                <w:rFonts w:ascii="Aptos" w:hAnsi="Aptos"/>
+                <w:rFonts w:ascii="Calibri" w:hAnsi="Calibri"/>
                 <w:color w:val="404040"/>
                 <w:sz w:val="17"/>
               </w:rPr>
@@ -2420,7 +2420,7 @@
           <w:p>
             <w:r>
               <w:rPr>
-                <w:rFonts w:ascii="Aptos" w:hAnsi="Aptos"/>
+                <w:rFonts w:ascii="Calibri" w:hAnsi="Calibri"/>
                 <w:color w:val="404040"/>
                 <w:sz w:val="17"/>
               </w:rPr>
@@ -2435,7 +2435,7 @@
           <w:p>
             <w:r>
               <w:rPr>
-                <w:rFonts w:ascii="Aptos" w:hAnsi="Aptos"/>
+                <w:rFonts w:ascii="Calibri" w:hAnsi="Calibri"/>
                 <w:color w:val="404040"/>
                 <w:sz w:val="17"/>
               </w:rPr>
@@ -2452,7 +2452,7 @@
           <w:p>
             <w:r>
               <w:rPr>
-                <w:rFonts w:ascii="Aptos" w:hAnsi="Aptos"/>
+                <w:rFonts w:ascii="Calibri" w:hAnsi="Calibri"/>
                 <w:color w:val="404040"/>
                 <w:sz w:val="17"/>
               </w:rPr>
@@ -2467,7 +2467,7 @@
           <w:p>
             <w:r>
               <w:rPr>
-                <w:rFonts w:ascii="Aptos" w:hAnsi="Aptos"/>
+                <w:rFonts w:ascii="Calibri" w:hAnsi="Calibri"/>
                 <w:color w:val="404040"/>
                 <w:sz w:val="17"/>
               </w:rPr>
@@ -2484,7 +2484,7 @@
           <w:p>
             <w:r>
               <w:rPr>
-                <w:rFonts w:ascii="Aptos" w:hAnsi="Aptos"/>
+                <w:rFonts w:ascii="Calibri" w:hAnsi="Calibri"/>
                 <w:color w:val="404040"/>
                 <w:sz w:val="17"/>
               </w:rPr>
@@ -2499,7 +2499,7 @@
           <w:p>
             <w:r>
               <w:rPr>
-                <w:rFonts w:ascii="Aptos" w:hAnsi="Aptos"/>
+                <w:rFonts w:ascii="Calibri" w:hAnsi="Calibri"/>
                 <w:color w:val="404040"/>
                 <w:sz w:val="17"/>
               </w:rPr>
@@ -2516,7 +2516,7 @@
           <w:p>
             <w:r>
               <w:rPr>
-                <w:rFonts w:ascii="Aptos" w:hAnsi="Aptos"/>
+                <w:rFonts w:ascii="Calibri" w:hAnsi="Calibri"/>
                 <w:color w:val="404040"/>
                 <w:sz w:val="17"/>
               </w:rPr>
@@ -2531,7 +2531,7 @@
           <w:p>
             <w:r>
               <w:rPr>
-                <w:rFonts w:ascii="Aptos" w:hAnsi="Aptos"/>
+                <w:rFonts w:ascii="Calibri" w:hAnsi="Calibri"/>
                 <w:color w:val="404040"/>
                 <w:sz w:val="17"/>
               </w:rPr>
@@ -2548,7 +2548,7 @@
           <w:p>
             <w:r>
               <w:rPr>
-                <w:rFonts w:ascii="Aptos" w:hAnsi="Aptos"/>
+                <w:rFonts w:ascii="Calibri" w:hAnsi="Calibri"/>
                 <w:color w:val="404040"/>
                 <w:sz w:val="17"/>
               </w:rPr>
@@ -2563,7 +2563,7 @@
           <w:p>
             <w:r>
               <w:rPr>
-                <w:rFonts w:ascii="Aptos" w:hAnsi="Aptos"/>
+                <w:rFonts w:ascii="Calibri" w:hAnsi="Calibri"/>
                 <w:color w:val="404040"/>
                 <w:sz w:val="17"/>
               </w:rPr>
@@ -2580,7 +2580,7 @@
           <w:p>
             <w:r>
               <w:rPr>
-                <w:rFonts w:ascii="Aptos" w:hAnsi="Aptos"/>
+                <w:rFonts w:ascii="Calibri" w:hAnsi="Calibri"/>
                 <w:color w:val="404040"/>
                 <w:sz w:val="17"/>
               </w:rPr>
@@ -2595,7 +2595,7 @@
           <w:p>
             <w:r>
               <w:rPr>
-                <w:rFonts w:ascii="Aptos" w:hAnsi="Aptos"/>
+                <w:rFonts w:ascii="Calibri" w:hAnsi="Calibri"/>
                 <w:color w:val="404040"/>
                 <w:sz w:val="17"/>
               </w:rPr>
@@ -2612,7 +2612,7 @@
           <w:p>
             <w:r>
               <w:rPr>
-                <w:rFonts w:ascii="Aptos" w:hAnsi="Aptos"/>
+                <w:rFonts w:ascii="Calibri" w:hAnsi="Calibri"/>
                 <w:color w:val="404040"/>
                 <w:sz w:val="17"/>
               </w:rPr>
@@ -2627,7 +2627,7 @@
           <w:p>
             <w:r>
               <w:rPr>
-                <w:rFonts w:ascii="Aptos" w:hAnsi="Aptos"/>
+                <w:rFonts w:ascii="Calibri" w:hAnsi="Calibri"/>
                 <w:color w:val="404040"/>
                 <w:sz w:val="17"/>
               </w:rPr>
@@ -2644,7 +2644,7 @@
           <w:p>
             <w:r>
               <w:rPr>
-                <w:rFonts w:ascii="Aptos" w:hAnsi="Aptos"/>
+                <w:rFonts w:ascii="Calibri" w:hAnsi="Calibri"/>
                 <w:color w:val="404040"/>
                 <w:sz w:val="17"/>
               </w:rPr>
@@ -2659,7 +2659,7 @@
           <w:p>
             <w:r>
               <w:rPr>
-                <w:rFonts w:ascii="Aptos" w:hAnsi="Aptos"/>
+                <w:rFonts w:ascii="Calibri" w:hAnsi="Calibri"/>
                 <w:color w:val="404040"/>
                 <w:sz w:val="17"/>
               </w:rPr>
@@ -2676,7 +2676,7 @@
           <w:p>
             <w:r>
               <w:rPr>
-                <w:rFonts w:ascii="Aptos" w:hAnsi="Aptos"/>
+                <w:rFonts w:ascii="Calibri" w:hAnsi="Calibri"/>
                 <w:color w:val="404040"/>
                 <w:sz w:val="17"/>
               </w:rPr>
@@ -2691,7 +2691,7 @@
           <w:p>
             <w:r>
               <w:rPr>
-                <w:rFonts w:ascii="Aptos" w:hAnsi="Aptos"/>
+                <w:rFonts w:ascii="Calibri" w:hAnsi="Calibri"/>
                 <w:color w:val="404040"/>
                 <w:sz w:val="17"/>
               </w:rPr>
@@ -2708,7 +2708,7 @@
           <w:p>
             <w:r>
               <w:rPr>
-                <w:rFonts w:ascii="Aptos" w:hAnsi="Aptos"/>
+                <w:rFonts w:ascii="Calibri" w:hAnsi="Calibri"/>
                 <w:color w:val="404040"/>
                 <w:sz w:val="17"/>
               </w:rPr>
@@ -2723,7 +2723,7 @@
           <w:p>
             <w:r>
               <w:rPr>
-                <w:rFonts w:ascii="Aptos" w:hAnsi="Aptos"/>
+                <w:rFonts w:ascii="Calibri" w:hAnsi="Calibri"/>
                 <w:color w:val="404040"/>
                 <w:sz w:val="17"/>
               </w:rPr>
@@ -2740,7 +2740,7 @@
           <w:p>
             <w:r>
               <w:rPr>
-                <w:rFonts w:ascii="Aptos" w:hAnsi="Aptos"/>
+                <w:rFonts w:ascii="Calibri" w:hAnsi="Calibri"/>
                 <w:color w:val="404040"/>
                 <w:sz w:val="17"/>
               </w:rPr>
@@ -2755,7 +2755,7 @@
           <w:p>
             <w:r>
               <w:rPr>
-                <w:rFonts w:ascii="Aptos" w:hAnsi="Aptos"/>
+                <w:rFonts w:ascii="Calibri" w:hAnsi="Calibri"/>
                 <w:color w:val="404040"/>
                 <w:sz w:val="17"/>
               </w:rPr>
@@ -2772,7 +2772,7 @@
           <w:p>
             <w:r>
               <w:rPr>
-                <w:rFonts w:ascii="Aptos" w:hAnsi="Aptos"/>
+                <w:rFonts w:ascii="Calibri" w:hAnsi="Calibri"/>
                 <w:color w:val="404040"/>
                 <w:sz w:val="17"/>
               </w:rPr>
@@ -2787,7 +2787,7 @@
           <w:p>
             <w:r>
               <w:rPr>
-                <w:rFonts w:ascii="Aptos" w:hAnsi="Aptos"/>
+                <w:rFonts w:ascii="Calibri" w:hAnsi="Calibri"/>
                 <w:color w:val="404040"/>
                 <w:sz w:val="17"/>
               </w:rPr>
@@ -2804,7 +2804,7 @@
           <w:p>
             <w:r>
               <w:rPr>
-                <w:rFonts w:ascii="Aptos" w:hAnsi="Aptos"/>
+                <w:rFonts w:ascii="Calibri" w:hAnsi="Calibri"/>
                 <w:color w:val="404040"/>
                 <w:sz w:val="17"/>
               </w:rPr>
@@ -2819,7 +2819,7 @@
           <w:p>
             <w:r>
               <w:rPr>
-                <w:rFonts w:ascii="Aptos" w:hAnsi="Aptos"/>
+                <w:rFonts w:ascii="Calibri" w:hAnsi="Calibri"/>
                 <w:color w:val="404040"/>
                 <w:sz w:val="17"/>
               </w:rPr>
@@ -2836,7 +2836,7 @@
           <w:p>
             <w:r>
               <w:rPr>
-                <w:rFonts w:ascii="Aptos" w:hAnsi="Aptos"/>
+                <w:rFonts w:ascii="Calibri" w:hAnsi="Calibri"/>
                 <w:color w:val="404040"/>
                 <w:sz w:val="17"/>
               </w:rPr>
@@ -2851,7 +2851,7 @@
           <w:p>
             <w:r>
               <w:rPr>
-                <w:rFonts w:ascii="Aptos" w:hAnsi="Aptos"/>
+                <w:rFonts w:ascii="Calibri" w:hAnsi="Calibri"/>
                 <w:color w:val="404040"/>
                 <w:sz w:val="17"/>
               </w:rPr>
@@ -2873,7 +2873,7 @@
       </w:pPr>
       <w:r>
         <w:rPr>
-          <w:rFonts w:ascii="Aptos" w:hAnsi="Aptos"/>
+          <w:rFonts w:ascii="Calibri" w:hAnsi="Calibri"/>
           <w:b/>
           <w:color w:val="16202A"/>
           <w:sz w:val="24"/>
@@ -2906,7 +2906,7 @@
             </w:pPr>
             <w:r>
               <w:rPr>
-                <w:rFonts w:ascii="Aptos" w:hAnsi="Aptos"/>
+                <w:rFonts w:ascii="Calibri" w:hAnsi="Calibri"/>
                 <w:b/>
                 <w:color w:val="FFFFFF"/>
                 <w:sz w:val="18"/>
@@ -2926,7 +2926,7 @@
             </w:pPr>
             <w:r>
               <w:rPr>
-                <w:rFonts w:ascii="Aptos" w:hAnsi="Aptos"/>
+                <w:rFonts w:ascii="Calibri" w:hAnsi="Calibri"/>
                 <w:b/>
                 <w:color w:val="FFFFFF"/>
                 <w:sz w:val="18"/>
@@ -2946,7 +2946,7 @@
             </w:pPr>
             <w:r>
               <w:rPr>
-                <w:rFonts w:ascii="Aptos" w:hAnsi="Aptos"/>
+                <w:rFonts w:ascii="Calibri" w:hAnsi="Calibri"/>
                 <w:b/>
                 <w:color w:val="FFFFFF"/>
                 <w:sz w:val="18"/>
@@ -2964,7 +2964,7 @@
           <w:p>
             <w:r>
               <w:rPr>
-                <w:rFonts w:ascii="Aptos" w:hAnsi="Aptos"/>
+                <w:rFonts w:ascii="Calibri" w:hAnsi="Calibri"/>
                 <w:color w:val="404040"/>
                 <w:sz w:val="17"/>
               </w:rPr>
@@ -2979,7 +2979,7 @@
           <w:p>
             <w:r>
               <w:rPr>
-                <w:rFonts w:ascii="Aptos" w:hAnsi="Aptos"/>
+                <w:rFonts w:ascii="Calibri" w:hAnsi="Calibri"/>
                 <w:color w:val="404040"/>
                 <w:sz w:val="17"/>
               </w:rPr>
@@ -2994,7 +2994,7 @@
           <w:p>
             <w:r>
               <w:rPr>
-                <w:rFonts w:ascii="Aptos" w:hAnsi="Aptos"/>
+                <w:rFonts w:ascii="Calibri" w:hAnsi="Calibri"/>
                 <w:color w:val="404040"/>
                 <w:sz w:val="17"/>
               </w:rPr>
@@ -3011,7 +3011,7 @@
           <w:p>
             <w:r>
               <w:rPr>
-                <w:rFonts w:ascii="Aptos" w:hAnsi="Aptos"/>
+                <w:rFonts w:ascii="Calibri" w:hAnsi="Calibri"/>
                 <w:color w:val="404040"/>
                 <w:sz w:val="17"/>
               </w:rPr>
@@ -3026,7 +3026,7 @@
           <w:p>
             <w:r>
               <w:rPr>
-                <w:rFonts w:ascii="Aptos" w:hAnsi="Aptos"/>
+                <w:rFonts w:ascii="Calibri" w:hAnsi="Calibri"/>
                 <w:color w:val="404040"/>
                 <w:sz w:val="17"/>
               </w:rPr>
@@ -3041,7 +3041,7 @@
           <w:p>
             <w:r>
               <w:rPr>
-                <w:rFonts w:ascii="Aptos" w:hAnsi="Aptos"/>
+                <w:rFonts w:ascii="Calibri" w:hAnsi="Calibri"/>
                 <w:color w:val="404040"/>
                 <w:sz w:val="17"/>
               </w:rPr>
@@ -3058,7 +3058,7 @@
           <w:p>
             <w:r>
               <w:rPr>
-                <w:rFonts w:ascii="Aptos" w:hAnsi="Aptos"/>
+                <w:rFonts w:ascii="Calibri" w:hAnsi="Calibri"/>
                 <w:color w:val="404040"/>
                 <w:sz w:val="17"/>
               </w:rPr>
@@ -3073,7 +3073,7 @@
           <w:p>
             <w:r>
               <w:rPr>
-                <w:rFonts w:ascii="Aptos" w:hAnsi="Aptos"/>
+                <w:rFonts w:ascii="Calibri" w:hAnsi="Calibri"/>
                 <w:color w:val="404040"/>
                 <w:sz w:val="17"/>
               </w:rPr>
@@ -3088,7 +3088,7 @@
           <w:p>
             <w:r>
               <w:rPr>
-                <w:rFonts w:ascii="Aptos" w:hAnsi="Aptos"/>
+                <w:rFonts w:ascii="Calibri" w:hAnsi="Calibri"/>
                 <w:color w:val="404040"/>
                 <w:sz w:val="17"/>
               </w:rPr>
@@ -3105,7 +3105,7 @@
           <w:p>
             <w:r>
               <w:rPr>
-                <w:rFonts w:ascii="Aptos" w:hAnsi="Aptos"/>
+                <w:rFonts w:ascii="Calibri" w:hAnsi="Calibri"/>
                 <w:color w:val="404040"/>
                 <w:sz w:val="17"/>
               </w:rPr>
@@ -3120,7 +3120,7 @@
           <w:p>
             <w:r>
               <w:rPr>
-                <w:rFonts w:ascii="Aptos" w:hAnsi="Aptos"/>
+                <w:rFonts w:ascii="Calibri" w:hAnsi="Calibri"/>
                 <w:color w:val="404040"/>
                 <w:sz w:val="17"/>
               </w:rPr>
@@ -3135,7 +3135,7 @@
           <w:p>
             <w:r>
               <w:rPr>
-                <w:rFonts w:ascii="Aptos" w:hAnsi="Aptos"/>
+                <w:rFonts w:ascii="Calibri" w:hAnsi="Calibri"/>
                 <w:color w:val="404040"/>
                 <w:sz w:val="17"/>
               </w:rPr>
@@ -3156,7 +3156,7 @@
       </w:pPr>
       <w:r>
         <w:rPr>
-          <w:rFonts w:ascii="Aptos" w:hAnsi="Aptos"/>
+          <w:rFonts w:ascii="Calibri" w:hAnsi="Calibri"/>
           <w:b w:val="0"/>
           <w:i w:val="0"/>
           <w:color w:val="404040"/>
@@ -3172,7 +3172,7 @@
       </w:pPr>
       <w:r>
         <w:rPr>
-          <w:rFonts w:ascii="Aptos" w:hAnsi="Aptos"/>
+          <w:rFonts w:ascii="Calibri" w:hAnsi="Calibri"/>
           <w:b/>
           <w:color w:val="16202A"/>
           <w:sz w:val="32"/>
@@ -3187,7 +3187,7 @@
       </w:pPr>
       <w:r>
         <w:rPr>
-          <w:rFonts w:ascii="Aptos" w:hAnsi="Aptos"/>
+          <w:rFonts w:ascii="Calibri" w:hAnsi="Calibri"/>
           <w:b/>
           <w:color w:val="16202A"/>
           <w:sz w:val="24"/>
@@ -3220,7 +3220,7 @@
             </w:pPr>
             <w:r>
               <w:rPr>
-                <w:rFonts w:ascii="Aptos" w:hAnsi="Aptos"/>
+                <w:rFonts w:ascii="Calibri" w:hAnsi="Calibri"/>
                 <w:b/>
                 <w:color w:val="FFFFFF"/>
                 <w:sz w:val="18"/>
@@ -3240,7 +3240,7 @@
             </w:pPr>
             <w:r>
               <w:rPr>
-                <w:rFonts w:ascii="Aptos" w:hAnsi="Aptos"/>
+                <w:rFonts w:ascii="Calibri" w:hAnsi="Calibri"/>
                 <w:b/>
                 <w:color w:val="FFFFFF"/>
                 <w:sz w:val="18"/>
@@ -3260,7 +3260,7 @@
             </w:pPr>
             <w:r>
               <w:rPr>
-                <w:rFonts w:ascii="Aptos" w:hAnsi="Aptos"/>
+                <w:rFonts w:ascii="Calibri" w:hAnsi="Calibri"/>
                 <w:b/>
                 <w:color w:val="FFFFFF"/>
                 <w:sz w:val="18"/>
@@ -3278,7 +3278,7 @@
           <w:p>
             <w:r>
               <w:rPr>
-                <w:rFonts w:ascii="Aptos" w:hAnsi="Aptos"/>
+                <w:rFonts w:ascii="Calibri" w:hAnsi="Calibri"/>
                 <w:color w:val="404040"/>
                 <w:sz w:val="17"/>
               </w:rPr>
@@ -3293,7 +3293,7 @@
           <w:p>
             <w:r>
               <w:rPr>
-                <w:rFonts w:ascii="Aptos" w:hAnsi="Aptos"/>
+                <w:rFonts w:ascii="Calibri" w:hAnsi="Calibri"/>
                 <w:color w:val="404040"/>
                 <w:sz w:val="17"/>
               </w:rPr>
@@ -3308,7 +3308,7 @@
           <w:p>
             <w:r>
               <w:rPr>
-                <w:rFonts w:ascii="Aptos" w:hAnsi="Aptos"/>
+                <w:rFonts w:ascii="Calibri" w:hAnsi="Calibri"/>
                 <w:color w:val="404040"/>
                 <w:sz w:val="17"/>
               </w:rPr>
@@ -3325,7 +3325,7 @@
           <w:p>
             <w:r>
               <w:rPr>
-                <w:rFonts w:ascii="Aptos" w:hAnsi="Aptos"/>
+                <w:rFonts w:ascii="Calibri" w:hAnsi="Calibri"/>
                 <w:color w:val="404040"/>
                 <w:sz w:val="17"/>
               </w:rPr>
@@ -3340,7 +3340,7 @@
           <w:p>
             <w:r>
               <w:rPr>
-                <w:rFonts w:ascii="Aptos" w:hAnsi="Aptos"/>
+                <w:rFonts w:ascii="Calibri" w:hAnsi="Calibri"/>
                 <w:color w:val="404040"/>
                 <w:sz w:val="17"/>
               </w:rPr>
@@ -3355,7 +3355,7 @@
           <w:p>
             <w:r>
               <w:rPr>
-                <w:rFonts w:ascii="Aptos" w:hAnsi="Aptos"/>
+                <w:rFonts w:ascii="Calibri" w:hAnsi="Calibri"/>
                 <w:color w:val="404040"/>
                 <w:sz w:val="17"/>
               </w:rPr>
@@ -3372,7 +3372,7 @@
           <w:p>
             <w:r>
               <w:rPr>
-                <w:rFonts w:ascii="Aptos" w:hAnsi="Aptos"/>
+                <w:rFonts w:ascii="Calibri" w:hAnsi="Calibri"/>
                 <w:color w:val="404040"/>
                 <w:sz w:val="17"/>
               </w:rPr>
@@ -3387,7 +3387,7 @@
           <w:p>
             <w:r>
               <w:rPr>
-                <w:rFonts w:ascii="Aptos" w:hAnsi="Aptos"/>
+                <w:rFonts w:ascii="Calibri" w:hAnsi="Calibri"/>
                 <w:color w:val="404040"/>
                 <w:sz w:val="17"/>
               </w:rPr>
@@ -3402,7 +3402,7 @@
           <w:p>
             <w:r>
               <w:rPr>
-                <w:rFonts w:ascii="Aptos" w:hAnsi="Aptos"/>
+                <w:rFonts w:ascii="Calibri" w:hAnsi="Calibri"/>
                 <w:color w:val="404040"/>
                 <w:sz w:val="17"/>
               </w:rPr>
@@ -3419,7 +3419,7 @@
           <w:p>
             <w:r>
               <w:rPr>
-                <w:rFonts w:ascii="Aptos" w:hAnsi="Aptos"/>
+                <w:rFonts w:ascii="Calibri" w:hAnsi="Calibri"/>
                 <w:color w:val="404040"/>
                 <w:sz w:val="17"/>
               </w:rPr>
@@ -3434,7 +3434,7 @@
           <w:p>
             <w:r>
               <w:rPr>
-                <w:rFonts w:ascii="Aptos" w:hAnsi="Aptos"/>
+                <w:rFonts w:ascii="Calibri" w:hAnsi="Calibri"/>
                 <w:color w:val="404040"/>
                 <w:sz w:val="17"/>
               </w:rPr>
@@ -3449,7 +3449,7 @@
           <w:p>
             <w:r>
               <w:rPr>
-                <w:rFonts w:ascii="Aptos" w:hAnsi="Aptos"/>
+                <w:rFonts w:ascii="Calibri" w:hAnsi="Calibri"/>
                 <w:color w:val="404040"/>
                 <w:sz w:val="17"/>
               </w:rPr>
@@ -3466,7 +3466,7 @@
           <w:p>
             <w:r>
               <w:rPr>
-                <w:rFonts w:ascii="Aptos" w:hAnsi="Aptos"/>
+                <w:rFonts w:ascii="Calibri" w:hAnsi="Calibri"/>
                 <w:color w:val="404040"/>
                 <w:sz w:val="17"/>
               </w:rPr>
@@ -3481,7 +3481,7 @@
           <w:p>
             <w:r>
               <w:rPr>
-                <w:rFonts w:ascii="Aptos" w:hAnsi="Aptos"/>
+                <w:rFonts w:ascii="Calibri" w:hAnsi="Calibri"/>
                 <w:color w:val="404040"/>
                 <w:sz w:val="17"/>
               </w:rPr>
@@ -3496,7 +3496,7 @@
           <w:p>
             <w:r>
               <w:rPr>
-                <w:rFonts w:ascii="Aptos" w:hAnsi="Aptos"/>
+                <w:rFonts w:ascii="Calibri" w:hAnsi="Calibri"/>
                 <w:color w:val="404040"/>
                 <w:sz w:val="17"/>
               </w:rPr>
@@ -3513,7 +3513,7 @@
           <w:p>
             <w:r>
               <w:rPr>
-                <w:rFonts w:ascii="Aptos" w:hAnsi="Aptos"/>
+                <w:rFonts w:ascii="Calibri" w:hAnsi="Calibri"/>
                 <w:color w:val="404040"/>
                 <w:sz w:val="17"/>
               </w:rPr>
@@ -3528,7 +3528,7 @@
           <w:p>
             <w:r>
               <w:rPr>
-                <w:rFonts w:ascii="Aptos" w:hAnsi="Aptos"/>
+                <w:rFonts w:ascii="Calibri" w:hAnsi="Calibri"/>
                 <w:color w:val="404040"/>
                 <w:sz w:val="17"/>
               </w:rPr>
@@ -3543,7 +3543,7 @@
           <w:p>
             <w:r>
               <w:rPr>
-                <w:rFonts w:ascii="Aptos" w:hAnsi="Aptos"/>
+                <w:rFonts w:ascii="Calibri" w:hAnsi="Calibri"/>
                 <w:color w:val="404040"/>
                 <w:sz w:val="17"/>
               </w:rPr>
@@ -3560,7 +3560,7 @@
           <w:p>
             <w:r>
               <w:rPr>
-                <w:rFonts w:ascii="Aptos" w:hAnsi="Aptos"/>
+                <w:rFonts w:ascii="Calibri" w:hAnsi="Calibri"/>
                 <w:color w:val="404040"/>
                 <w:sz w:val="17"/>
               </w:rPr>
@@ -3575,7 +3575,7 @@
           <w:p>
             <w:r>
               <w:rPr>
-                <w:rFonts w:ascii="Aptos" w:hAnsi="Aptos"/>
+                <w:rFonts w:ascii="Calibri" w:hAnsi="Calibri"/>
                 <w:color w:val="404040"/>
                 <w:sz w:val="17"/>
               </w:rPr>
@@ -3590,7 +3590,7 @@
           <w:p>
             <w:r>
               <w:rPr>
-                <w:rFonts w:ascii="Aptos" w:hAnsi="Aptos"/>
+                <w:rFonts w:ascii="Calibri" w:hAnsi="Calibri"/>
                 <w:color w:val="404040"/>
                 <w:sz w:val="17"/>
               </w:rPr>
@@ -3607,7 +3607,7 @@
           <w:p>
             <w:r>
               <w:rPr>
-                <w:rFonts w:ascii="Aptos" w:hAnsi="Aptos"/>
+                <w:rFonts w:ascii="Calibri" w:hAnsi="Calibri"/>
                 <w:color w:val="404040"/>
                 <w:sz w:val="17"/>
               </w:rPr>
@@ -3622,7 +3622,7 @@
           <w:p>
             <w:r>
               <w:rPr>
-                <w:rFonts w:ascii="Aptos" w:hAnsi="Aptos"/>
+                <w:rFonts w:ascii="Calibri" w:hAnsi="Calibri"/>
                 <w:color w:val="404040"/>
                 <w:sz w:val="17"/>
               </w:rPr>
@@ -3637,7 +3637,7 @@
           <w:p>
             <w:r>
               <w:rPr>
-                <w:rFonts w:ascii="Aptos" w:hAnsi="Aptos"/>
+                <w:rFonts w:ascii="Calibri" w:hAnsi="Calibri"/>
                 <w:color w:val="404040"/>
                 <w:sz w:val="17"/>
               </w:rPr>
@@ -3654,7 +3654,7 @@
           <w:p>
             <w:r>
               <w:rPr>
-                <w:rFonts w:ascii="Aptos" w:hAnsi="Aptos"/>
+                <w:rFonts w:ascii="Calibri" w:hAnsi="Calibri"/>
                 <w:color w:val="404040"/>
                 <w:sz w:val="17"/>
               </w:rPr>
@@ -3669,7 +3669,7 @@
           <w:p>
             <w:r>
               <w:rPr>
-                <w:rFonts w:ascii="Aptos" w:hAnsi="Aptos"/>
+                <w:rFonts w:ascii="Calibri" w:hAnsi="Calibri"/>
                 <w:color w:val="404040"/>
                 <w:sz w:val="17"/>
               </w:rPr>
@@ -3684,7 +3684,7 @@
           <w:p>
             <w:r>
               <w:rPr>
-                <w:rFonts w:ascii="Aptos" w:hAnsi="Aptos"/>
+                <w:rFonts w:ascii="Calibri" w:hAnsi="Calibri"/>
                 <w:color w:val="404040"/>
                 <w:sz w:val="17"/>
               </w:rPr>
@@ -3701,7 +3701,7 @@
           <w:p>
             <w:r>
               <w:rPr>
-                <w:rFonts w:ascii="Aptos" w:hAnsi="Aptos"/>
+                <w:rFonts w:ascii="Calibri" w:hAnsi="Calibri"/>
                 <w:color w:val="404040"/>
                 <w:sz w:val="17"/>
               </w:rPr>
@@ -3716,7 +3716,7 @@
           <w:p>
             <w:r>
               <w:rPr>
-                <w:rFonts w:ascii="Aptos" w:hAnsi="Aptos"/>
+                <w:rFonts w:ascii="Calibri" w:hAnsi="Calibri"/>
                 <w:color w:val="404040"/>
                 <w:sz w:val="17"/>
               </w:rPr>
@@ -3731,7 +3731,7 @@
           <w:p>
             <w:r>
               <w:rPr>
-                <w:rFonts w:ascii="Aptos" w:hAnsi="Aptos"/>
+                <w:rFonts w:ascii="Calibri" w:hAnsi="Calibri"/>
                 <w:color w:val="404040"/>
                 <w:sz w:val="17"/>
               </w:rPr>
@@ -3748,7 +3748,7 @@
           <w:p>
             <w:r>
               <w:rPr>
-                <w:rFonts w:ascii="Aptos" w:hAnsi="Aptos"/>
+                <w:rFonts w:ascii="Calibri" w:hAnsi="Calibri"/>
                 <w:color w:val="404040"/>
                 <w:sz w:val="17"/>
               </w:rPr>
@@ -3763,7 +3763,7 @@
           <w:p>
             <w:r>
               <w:rPr>
-                <w:rFonts w:ascii="Aptos" w:hAnsi="Aptos"/>
+                <w:rFonts w:ascii="Calibri" w:hAnsi="Calibri"/>
                 <w:color w:val="404040"/>
                 <w:sz w:val="17"/>
               </w:rPr>
@@ -3778,7 +3778,7 @@
           <w:p>
             <w:r>
               <w:rPr>
-                <w:rFonts w:ascii="Aptos" w:hAnsi="Aptos"/>
+                <w:rFonts w:ascii="Calibri" w:hAnsi="Calibri"/>
                 <w:color w:val="404040"/>
                 <w:sz w:val="17"/>
               </w:rPr>
@@ -3795,7 +3795,7 @@
           <w:p>
             <w:r>
               <w:rPr>
-                <w:rFonts w:ascii="Aptos" w:hAnsi="Aptos"/>
+                <w:rFonts w:ascii="Calibri" w:hAnsi="Calibri"/>
                 <w:color w:val="404040"/>
                 <w:sz w:val="17"/>
               </w:rPr>
@@ -3810,7 +3810,7 @@
           <w:p>
             <w:r>
               <w:rPr>
-                <w:rFonts w:ascii="Aptos" w:hAnsi="Aptos"/>
+                <w:rFonts w:ascii="Calibri" w:hAnsi="Calibri"/>
                 <w:color w:val="404040"/>
                 <w:sz w:val="17"/>
               </w:rPr>
@@ -3825,7 +3825,7 @@
           <w:p>
             <w:r>
               <w:rPr>
-                <w:rFonts w:ascii="Aptos" w:hAnsi="Aptos"/>
+                <w:rFonts w:ascii="Calibri" w:hAnsi="Calibri"/>
                 <w:color w:val="404040"/>
                 <w:sz w:val="17"/>
               </w:rPr>
@@ -3842,7 +3842,7 @@
           <w:p>
             <w:r>
               <w:rPr>
-                <w:rFonts w:ascii="Aptos" w:hAnsi="Aptos"/>
+                <w:rFonts w:ascii="Calibri" w:hAnsi="Calibri"/>
                 <w:color w:val="404040"/>
                 <w:sz w:val="17"/>
               </w:rPr>
@@ -3857,7 +3857,7 @@
           <w:p>
             <w:r>
               <w:rPr>
-                <w:rFonts w:ascii="Aptos" w:hAnsi="Aptos"/>
+                <w:rFonts w:ascii="Calibri" w:hAnsi="Calibri"/>
                 <w:color w:val="404040"/>
                 <w:sz w:val="17"/>
               </w:rPr>
@@ -3872,7 +3872,7 @@
           <w:p>
             <w:r>
               <w:rPr>
-                <w:rFonts w:ascii="Aptos" w:hAnsi="Aptos"/>
+                <w:rFonts w:ascii="Calibri" w:hAnsi="Calibri"/>
                 <w:color w:val="404040"/>
                 <w:sz w:val="17"/>
               </w:rPr>
@@ -3889,7 +3889,7 @@
           <w:p>
             <w:r>
               <w:rPr>
-                <w:rFonts w:ascii="Aptos" w:hAnsi="Aptos"/>
+                <w:rFonts w:ascii="Calibri" w:hAnsi="Calibri"/>
                 <w:color w:val="404040"/>
                 <w:sz w:val="17"/>
               </w:rPr>
@@ -3904,7 +3904,7 @@
           <w:p>
             <w:r>
               <w:rPr>
-                <w:rFonts w:ascii="Aptos" w:hAnsi="Aptos"/>
+                <w:rFonts w:ascii="Calibri" w:hAnsi="Calibri"/>
                 <w:color w:val="404040"/>
                 <w:sz w:val="17"/>
               </w:rPr>
@@ -3919,7 +3919,7 @@
           <w:p>
             <w:r>
               <w:rPr>
-                <w:rFonts w:ascii="Aptos" w:hAnsi="Aptos"/>
+                <w:rFonts w:ascii="Calibri" w:hAnsi="Calibri"/>
                 <w:color w:val="404040"/>
                 <w:sz w:val="17"/>
               </w:rPr>
@@ -3936,7 +3936,7 @@
           <w:p>
             <w:r>
               <w:rPr>
-                <w:rFonts w:ascii="Aptos" w:hAnsi="Aptos"/>
+                <w:rFonts w:ascii="Calibri" w:hAnsi="Calibri"/>
                 <w:color w:val="404040"/>
                 <w:sz w:val="17"/>
               </w:rPr>
@@ -3951,7 +3951,7 @@
           <w:p>
             <w:r>
               <w:rPr>
-                <w:rFonts w:ascii="Aptos" w:hAnsi="Aptos"/>
+                <w:rFonts w:ascii="Calibri" w:hAnsi="Calibri"/>
                 <w:color w:val="404040"/>
                 <w:sz w:val="17"/>
               </w:rPr>
@@ -3966,7 +3966,7 @@
           <w:p>
             <w:r>
               <w:rPr>
-                <w:rFonts w:ascii="Aptos" w:hAnsi="Aptos"/>
+                <w:rFonts w:ascii="Calibri" w:hAnsi="Calibri"/>
                 <w:color w:val="404040"/>
                 <w:sz w:val="17"/>
               </w:rPr>
@@ -3983,7 +3983,7 @@
           <w:p>
             <w:r>
               <w:rPr>
-                <w:rFonts w:ascii="Aptos" w:hAnsi="Aptos"/>
+                <w:rFonts w:ascii="Calibri" w:hAnsi="Calibri"/>
                 <w:color w:val="404040"/>
                 <w:sz w:val="17"/>
               </w:rPr>
@@ -3998,7 +3998,7 @@
           <w:p>
             <w:r>
               <w:rPr>
-                <w:rFonts w:ascii="Aptos" w:hAnsi="Aptos"/>
+                <w:rFonts w:ascii="Calibri" w:hAnsi="Calibri"/>
                 <w:color w:val="404040"/>
                 <w:sz w:val="17"/>
               </w:rPr>
@@ -4013,7 +4013,7 @@
           <w:p>
             <w:r>
               <w:rPr>
-                <w:rFonts w:ascii="Aptos" w:hAnsi="Aptos"/>
+                <w:rFonts w:ascii="Calibri" w:hAnsi="Calibri"/>
                 <w:color w:val="404040"/>
                 <w:sz w:val="17"/>
               </w:rPr>
@@ -4030,7 +4030,7 @@
           <w:p>
             <w:r>
               <w:rPr>
-                <w:rFonts w:ascii="Aptos" w:hAnsi="Aptos"/>
+                <w:rFonts w:ascii="Calibri" w:hAnsi="Calibri"/>
                 <w:color w:val="404040"/>
                 <w:sz w:val="17"/>
               </w:rPr>
@@ -4045,7 +4045,7 @@
           <w:p>
             <w:r>
               <w:rPr>
-                <w:rFonts w:ascii="Aptos" w:hAnsi="Aptos"/>
+                <w:rFonts w:ascii="Calibri" w:hAnsi="Calibri"/>
                 <w:color w:val="404040"/>
                 <w:sz w:val="17"/>
               </w:rPr>
@@ -4060,7 +4060,7 @@
           <w:p>
             <w:r>
               <w:rPr>
-                <w:rFonts w:ascii="Aptos" w:hAnsi="Aptos"/>
+                <w:rFonts w:ascii="Calibri" w:hAnsi="Calibri"/>
                 <w:color w:val="404040"/>
                 <w:sz w:val="17"/>
               </w:rPr>
@@ -4077,7 +4077,7 @@
           <w:p>
             <w:r>
               <w:rPr>
-                <w:rFonts w:ascii="Aptos" w:hAnsi="Aptos"/>
+                <w:rFonts w:ascii="Calibri" w:hAnsi="Calibri"/>
                 <w:color w:val="404040"/>
                 <w:sz w:val="17"/>
               </w:rPr>
@@ -4092,7 +4092,7 @@
           <w:p>
             <w:r>
               <w:rPr>
-                <w:rFonts w:ascii="Aptos" w:hAnsi="Aptos"/>
+                <w:rFonts w:ascii="Calibri" w:hAnsi="Calibri"/>
                 <w:color w:val="404040"/>
                 <w:sz w:val="17"/>
               </w:rPr>
@@ -4107,7 +4107,7 @@
           <w:p>
             <w:r>
               <w:rPr>
-                <w:rFonts w:ascii="Aptos" w:hAnsi="Aptos"/>
+                <w:rFonts w:ascii="Calibri" w:hAnsi="Calibri"/>
                 <w:color w:val="404040"/>
                 <w:sz w:val="17"/>
               </w:rPr>
@@ -4124,7 +4124,7 @@
           <w:p>
             <w:r>
               <w:rPr>
-                <w:rFonts w:ascii="Aptos" w:hAnsi="Aptos"/>
+                <w:rFonts w:ascii="Calibri" w:hAnsi="Calibri"/>
                 <w:color w:val="404040"/>
                 <w:sz w:val="17"/>
               </w:rPr>
@@ -4139,7 +4139,7 @@
           <w:p>
             <w:r>
               <w:rPr>
-                <w:rFonts w:ascii="Aptos" w:hAnsi="Aptos"/>
+                <w:rFonts w:ascii="Calibri" w:hAnsi="Calibri"/>
                 <w:color w:val="404040"/>
                 <w:sz w:val="17"/>
               </w:rPr>
@@ -4154,7 +4154,7 @@
           <w:p>
             <w:r>
               <w:rPr>
-                <w:rFonts w:ascii="Aptos" w:hAnsi="Aptos"/>
+                <w:rFonts w:ascii="Calibri" w:hAnsi="Calibri"/>
                 <w:color w:val="404040"/>
                 <w:sz w:val="17"/>
               </w:rPr>
@@ -4171,7 +4171,7 @@
           <w:p>
             <w:r>
               <w:rPr>
-                <w:rFonts w:ascii="Aptos" w:hAnsi="Aptos"/>
+                <w:rFonts w:ascii="Calibri" w:hAnsi="Calibri"/>
                 <w:color w:val="404040"/>
                 <w:sz w:val="17"/>
               </w:rPr>
@@ -4186,7 +4186,7 @@
           <w:p>
             <w:r>
               <w:rPr>
-                <w:rFonts w:ascii="Aptos" w:hAnsi="Aptos"/>
+                <w:rFonts w:ascii="Calibri" w:hAnsi="Calibri"/>
                 <w:color w:val="404040"/>
                 <w:sz w:val="17"/>
               </w:rPr>
@@ -4201,7 +4201,7 @@
           <w:p>
             <w:r>
               <w:rPr>
-                <w:rFonts w:ascii="Aptos" w:hAnsi="Aptos"/>
+                <w:rFonts w:ascii="Calibri" w:hAnsi="Calibri"/>
                 <w:color w:val="404040"/>
                 <w:sz w:val="17"/>
               </w:rPr>
@@ -4223,7 +4223,7 @@
       </w:pPr>
       <w:r>
         <w:rPr>
-          <w:rFonts w:ascii="Aptos" w:hAnsi="Aptos"/>
+          <w:rFonts w:ascii="Calibri" w:hAnsi="Calibri"/>
           <w:b/>
           <w:color w:val="16202A"/>
           <w:sz w:val="24"/>
@@ -4238,7 +4238,7 @@
       </w:pPr>
       <w:r>
         <w:rPr>
-          <w:rFonts w:ascii="Aptos" w:hAnsi="Aptos"/>
+          <w:rFonts w:ascii="Calibri" w:hAnsi="Calibri"/>
           <w:sz w:val="20"/>
         </w:rPr>
         <w:t>Provider (name, phone, email, password) required; email regex, phone ^[6-9]\d{9}$, password &gt;=6</w:t>
@@ -4251,7 +4251,7 @@
       </w:pPr>
       <w:r>
         <w:rPr>
-          <w:rFonts w:ascii="Aptos" w:hAnsi="Aptos"/>
+          <w:rFonts w:ascii="Calibri" w:hAnsi="Calibri"/>
           <w:sz w:val="20"/>
         </w:rPr>
         <w:t>Equipment: name, type, location, price required; type IN enum, price &gt;0</w:t>
@@ -4264,7 +4264,7 @@
       </w:pPr>
       <w:r>
         <w:rPr>
-          <w:rFonts w:ascii="Aptos" w:hAnsi="Aptos"/>
+          <w:rFonts w:ascii="Calibri" w:hAnsi="Calibri"/>
           <w:sz w:val="20"/>
         </w:rPr>
         <w:t>Booking: equipment exists, availability='available', renter != owner, dates valid, end &gt;= start</w:t>
@@ -4277,7 +4277,7 @@
       </w:pPr>
       <w:r>
         <w:rPr>
-          <w:rFonts w:ascii="Aptos" w:hAnsi="Aptos"/>
+          <w:rFonts w:ascii="Calibri" w:hAnsi="Calibri"/>
           <w:sz w:val="20"/>
         </w:rPr>
         <w:t>Status IN ('pending','confirmed','completed','cancelled'), rating 1-5</w:t>
@@ -4290,7 +4290,7 @@
       </w:pPr>
       <w:r>
         <w:rPr>
-          <w:rFonts w:ascii="Aptos" w:hAnsi="Aptos"/>
+          <w:rFonts w:ascii="Calibri" w:hAnsi="Calibri"/>
           <w:sz w:val="20"/>
         </w:rPr>
         <w:t>Invalid â†’ 400 with JSON error; unknown â†’ 404; server error â†’ 500 without details</w:t>
@@ -4303,7 +4303,7 @@
       </w:pPr>
       <w:r>
         <w:rPr>
-          <w:rFonts w:ascii="Aptos" w:hAnsi="Aptos"/>
+          <w:rFonts w:ascii="Calibri" w:hAnsi="Calibri"/>
           <w:b/>
           <w:color w:val="16202A"/>
           <w:sz w:val="24"/>
@@ -4317,7 +4317,7 @@
       </w:pPr>
       <w:r>
         <w:rPr>
-          <w:rFonts w:ascii="Aptos" w:hAnsi="Aptos"/>
+          <w:rFonts w:ascii="Calibri" w:hAnsi="Calibri"/>
           <w:b w:val="0"/>
           <w:i w:val="0"/>
           <w:color w:val="404040"/>
@@ -4332,7 +4332,7 @@
       </w:pPr>
       <w:r>
         <w:rPr>
-          <w:rFonts w:ascii="Aptos" w:hAnsi="Aptos"/>
+          <w:rFonts w:ascii="Calibri" w:hAnsi="Calibri"/>
           <w:b w:val="0"/>
           <w:i w:val="0"/>
           <w:color w:val="404040"/>
@@ -4348,7 +4348,7 @@
       </w:pPr>
       <w:r>
         <w:rPr>
-          <w:rFonts w:ascii="Aptos" w:hAnsi="Aptos"/>
+          <w:rFonts w:ascii="Calibri" w:hAnsi="Calibri"/>
           <w:b/>
           <w:color w:val="16202A"/>
           <w:sz w:val="32"/>
@@ -4363,7 +4363,7 @@
       </w:pPr>
       <w:r>
         <w:rPr>
-          <w:rFonts w:ascii="Aptos" w:hAnsi="Aptos"/>
+          <w:rFonts w:ascii="Calibri" w:hAnsi="Calibri"/>
           <w:b/>
           <w:color w:val="16202A"/>
           <w:sz w:val="24"/>
@@ -4378,7 +4378,7 @@
       </w:pPr>
       <w:r>
         <w:rPr>
-          <w:rFonts w:ascii="Aptos" w:hAnsi="Aptos"/>
+          <w:rFonts w:ascii="Calibri" w:hAnsi="Calibri"/>
           <w:sz w:val="20"/>
         </w:rPr>
         <w:t>Passwords: bcryptjs 10 rounds, hashSync on register, compare on login, never return hash</w:t>
@@ -4391,7 +4391,7 @@
       </w:pPr>
       <w:r>
         <w:rPr>
-          <w:rFonts w:ascii="Aptos" w:hAnsi="Aptos"/>
+          <w:rFonts w:ascii="Calibri" w:hAnsi="Calibri"/>
           <w:sz w:val="20"/>
         </w:rPr>
         <w:t>JWT: sign {id,email,name} with JWT_SECRET, Bearer header, 401/403, 7d expiry</w:t>
@@ -4404,7 +4404,7 @@
       </w:pPr>
       <w:r>
         <w:rPr>
-          <w:rFonts w:ascii="Aptos" w:hAnsi="Aptos"/>
+          <w:rFonts w:ascii="Calibri" w:hAnsi="Calibri"/>
           <w:sz w:val="20"/>
         </w:rPr>
         <w:t>SQL injection: Parameterized queries with ? placeholders, tested ' OR '1'='1 â†’ 0 results</w:t>
@@ -4417,7 +4417,7 @@
       </w:pPr>
       <w:r>
         <w:rPr>
-          <w:rFonts w:ascii="Aptos" w:hAnsi="Aptos"/>
+          <w:rFonts w:ascii="Calibri" w:hAnsi="Calibri"/>
           <w:sz w:val="20"/>
         </w:rPr>
         <w:t>Authorization: Only owner edits/deletes equipment, only owner/renter views bookings, renter != owner</w:t>
@@ -4430,7 +4430,7 @@
       </w:pPr>
       <w:r>
         <w:rPr>
-          <w:rFonts w:ascii="Aptos" w:hAnsi="Aptos"/>
+          <w:rFonts w:ascii="Calibri" w:hAnsi="Calibri"/>
           <w:sz w:val="20"/>
         </w:rPr>
         <w:t>Validation: All inputs checked, 400 errors, CORS *, secrets in .env not committed</w:t>
@@ -4443,7 +4443,7 @@
       </w:pPr>
       <w:r>
         <w:rPr>
-          <w:rFonts w:ascii="Aptos" w:hAnsi="Aptos"/>
+          <w:rFonts w:ascii="Calibri" w:hAnsi="Calibri"/>
           <w:sz w:val="20"/>
         </w:rPr>
         <w:t>XSS: escapeHtml() for workspace/equipment names when inserting into DOM</w:t>
@@ -4456,7 +4456,7 @@
       </w:pPr>
       <w:r>
         <w:rPr>
-          <w:rFonts w:ascii="Aptos" w:hAnsi="Aptos"/>
+          <w:rFonts w:ascii="Calibri" w:hAnsi="Calibri"/>
           <w:b/>
           <w:color w:val="16202A"/>
           <w:sz w:val="24"/>
@@ -4471,7 +4471,7 @@
       </w:pPr>
       <w:r>
         <w:rPr>
-          <w:rFonts w:ascii="Aptos" w:hAnsi="Aptos"/>
+          <w:rFonts w:ascii="Calibri" w:hAnsi="Calibri"/>
           <w:sz w:val="20"/>
         </w:rPr>
         <w:t>PRAGMA foreign_keys = ON enforces relationships, ON DELETE CASCADE cleans up</w:t>
@@ -4484,7 +4484,7 @@
       </w:pPr>
       <w:r>
         <w:rPr>
-          <w:rFonts w:ascii="Aptos" w:hAnsi="Aptos"/>
+          <w:rFonts w:ascii="Calibri" w:hAnsi="Calibri"/>
           <w:sz w:val="20"/>
         </w:rPr>
         <w:t>PRAGMA journal_mode = WAL improves concurrent reads (local)</w:t>
@@ -4497,7 +4497,7 @@
       </w:pPr>
       <w:r>
         <w:rPr>
-          <w:rFonts w:ascii="Aptos" w:hAnsi="Aptos"/>
+          <w:rFonts w:ascii="Calibri" w:hAnsi="Calibri"/>
           <w:sz w:val="20"/>
         </w:rPr>
         <w:t>Seed only when users=0, idempotent</w:t>
@@ -4510,7 +4510,7 @@
       </w:pPr>
       <w:r>
         <w:rPr>
-          <w:rFonts w:ascii="Aptos" w:hAnsi="Aptos"/>
+          <w:rFonts w:ascii="Calibri" w:hAnsi="Calibri"/>
           <w:sz w:val="20"/>
         </w:rPr>
         <w:t>Error handlers return JSON without leaking stack to client</w:t>
@@ -4523,7 +4523,7 @@
       </w:pPr>
       <w:r>
         <w:rPr>
-          <w:rFonts w:ascii="Aptos" w:hAnsi="Aptos"/>
+          <w:rFonts w:ascii="Calibri" w:hAnsi="Calibri"/>
           <w:sz w:val="20"/>
         </w:rPr>
         <w:t>Vercel /tmp handling ensures DB works serverless (ephemeral, demo)</w:t>
@@ -4536,7 +4536,7 @@
       </w:pPr>
       <w:r>
         <w:rPr>
-          <w:rFonts w:ascii="Aptos" w:hAnsi="Aptos"/>
+          <w:rFonts w:ascii="Calibri" w:hAnsi="Calibri"/>
           <w:b/>
           <w:color w:val="16202A"/>
           <w:sz w:val="24"/>
@@ -4551,7 +4551,7 @@
       </w:pPr>
       <w:r>
         <w:rPr>
-          <w:rFonts w:ascii="Aptos" w:hAnsi="Aptos"/>
+          <w:rFonts w:ascii="Calibri" w:hAnsi="Calibri"/>
           <w:sz w:val="20"/>
         </w:rPr>
         <w:t>SQLite on Vercel is ephemeral (resets cold start) â†’ for prod use Supabase/Neon Postgres + Prisma</w:t>
@@ -4564,7 +4564,7 @@
       </w:pPr>
       <w:r>
         <w:rPr>
-          <w:rFonts w:ascii="Aptos" w:hAnsi="Aptos"/>
+          <w:rFonts w:ascii="Calibri" w:hAnsi="Calibri"/>
           <w:sz w:val="20"/>
         </w:rPr>
         <w:t>Image via URL, not upload â†’ for prod use S3/Cloudinary with multer</w:t>
@@ -4577,7 +4577,7 @@
       </w:pPr>
       <w:r>
         <w:rPr>
-          <w:rFonts w:ascii="Aptos" w:hAnsi="Aptos"/>
+          <w:rFonts w:ascii="Calibri" w:hAnsi="Calibri"/>
           <w:sz w:val="20"/>
         </w:rPr>
         <w:t>No payment gateway â†’ add Razorpay/UPI with escrow</w:t>
@@ -4590,7 +4590,7 @@
       </w:pPr>
       <w:r>
         <w:rPr>
-          <w:rFonts w:ascii="Aptos" w:hAnsi="Aptos"/>
+          <w:rFonts w:ascii="Calibri" w:hAnsi="Calibri"/>
           <w:sz w:val="20"/>
         </w:rPr>
         <w:t>Mock weather â†’ replace with OpenWeather + caching</w:t>
@@ -4603,7 +4603,7 @@
       </w:pPr>
       <w:r>
         <w:rPr>
-          <w:rFonts w:ascii="Aptos" w:hAnsi="Aptos"/>
+          <w:rFonts w:ascii="Calibri" w:hAnsi="Calibri"/>
           <w:sz w:val="20"/>
         </w:rPr>
         <w:t>No pagination â†’ add LIMIT/OFFSET for 1000+ equipment</w:t>
@@ -4616,7 +4616,7 @@
       </w:pPr>
       <w:r>
         <w:rPr>
-          <w:rFonts w:ascii="Aptos" w:hAnsi="Aptos"/>
+          <w:rFonts w:ascii="Calibri" w:hAnsi="Calibri"/>
           <w:sz w:val="20"/>
         </w:rPr>
         <w:t>JWT in localStorage â†’ for prod use HttpOnly cookie + refresh token</w:t>
@@ -4629,7 +4629,7 @@
       </w:pPr>
       <w:r>
         <w:rPr>
-          <w:rFonts w:ascii="Aptos" w:hAnsi="Aptos"/>
+          <w:rFonts w:ascii="Calibri" w:hAnsi="Calibri"/>
           <w:b/>
           <w:color w:val="16202A"/>
           <w:sz w:val="32"/>
@@ -4643,7 +4643,7 @@
       </w:pPr>
       <w:r>
         <w:rPr>
-          <w:rFonts w:ascii="Aptos" w:hAnsi="Aptos"/>
+          <w:rFonts w:ascii="Calibri" w:hAnsi="Calibri"/>
           <w:b/>
           <w:i w:val="0"/>
           <w:color w:val="404040"/>
@@ -4677,7 +4677,7 @@
             </w:pPr>
             <w:r>
               <w:rPr>
-                <w:rFonts w:ascii="Aptos" w:hAnsi="Aptos"/>
+                <w:rFonts w:ascii="Calibri" w:hAnsi="Calibri"/>
                 <w:b/>
                 <w:color w:val="FFFFFF"/>
                 <w:sz w:val="18"/>
@@ -4697,7 +4697,7 @@
             </w:pPr>
             <w:r>
               <w:rPr>
-                <w:rFonts w:ascii="Aptos" w:hAnsi="Aptos"/>
+                <w:rFonts w:ascii="Calibri" w:hAnsi="Calibri"/>
                 <w:b/>
                 <w:color w:val="FFFFFF"/>
                 <w:sz w:val="18"/>
@@ -4717,7 +4717,7 @@
             </w:pPr>
             <w:r>
               <w:rPr>
-                <w:rFonts w:ascii="Aptos" w:hAnsi="Aptos"/>
+                <w:rFonts w:ascii="Calibri" w:hAnsi="Calibri"/>
                 <w:b/>
                 <w:color w:val="FFFFFF"/>
                 <w:sz w:val="18"/>
@@ -4735,7 +4735,7 @@
           <w:p>
             <w:r>
               <w:rPr>
-                <w:rFonts w:ascii="Aptos" w:hAnsi="Aptos"/>
+                <w:rFonts w:ascii="Calibri" w:hAnsi="Calibri"/>
                 <w:color w:val="404040"/>
                 <w:sz w:val="17"/>
               </w:rPr>
@@ -4750,7 +4750,7 @@
           <w:p>
             <w:r>
               <w:rPr>
-                <w:rFonts w:ascii="Aptos" w:hAnsi="Aptos"/>
+                <w:rFonts w:ascii="Calibri" w:hAnsi="Calibri"/>
                 <w:color w:val="404040"/>
                 <w:sz w:val="17"/>
               </w:rPr>
@@ -4765,7 +4765,7 @@
           <w:p>
             <w:r>
               <w:rPr>
-                <w:rFonts w:ascii="Aptos" w:hAnsi="Aptos"/>
+                <w:rFonts w:ascii="Calibri" w:hAnsi="Calibri"/>
                 <w:color w:val="404040"/>
                 <w:sz w:val="17"/>
               </w:rPr>
@@ -4782,7 +4782,7 @@
           <w:p>
             <w:r>
               <w:rPr>
-                <w:rFonts w:ascii="Aptos" w:hAnsi="Aptos"/>
+                <w:rFonts w:ascii="Calibri" w:hAnsi="Calibri"/>
                 <w:color w:val="404040"/>
                 <w:sz w:val="17"/>
               </w:rPr>
@@ -4797,7 +4797,7 @@
           <w:p>
             <w:r>
               <w:rPr>
-                <w:rFonts w:ascii="Aptos" w:hAnsi="Aptos"/>
+                <w:rFonts w:ascii="Calibri" w:hAnsi="Calibri"/>
                 <w:color w:val="404040"/>
                 <w:sz w:val="17"/>
               </w:rPr>
@@ -4812,7 +4812,7 @@
           <w:p>
             <w:r>
               <w:rPr>
-                <w:rFonts w:ascii="Aptos" w:hAnsi="Aptos"/>
+                <w:rFonts w:ascii="Calibri" w:hAnsi="Calibri"/>
                 <w:color w:val="404040"/>
                 <w:sz w:val="17"/>
               </w:rPr>
@@ -4829,7 +4829,7 @@
           <w:p>
             <w:r>
               <w:rPr>
-                <w:rFonts w:ascii="Aptos" w:hAnsi="Aptos"/>
+                <w:rFonts w:ascii="Calibri" w:hAnsi="Calibri"/>
                 <w:color w:val="404040"/>
                 <w:sz w:val="17"/>
               </w:rPr>
@@ -4844,7 +4844,7 @@
           <w:p>
             <w:r>
               <w:rPr>
-                <w:rFonts w:ascii="Aptos" w:hAnsi="Aptos"/>
+                <w:rFonts w:ascii="Calibri" w:hAnsi="Calibri"/>
                 <w:color w:val="404040"/>
                 <w:sz w:val="17"/>
               </w:rPr>
@@ -4859,7 +4859,7 @@
           <w:p>
             <w:r>
               <w:rPr>
-                <w:rFonts w:ascii="Aptos" w:hAnsi="Aptos"/>
+                <w:rFonts w:ascii="Calibri" w:hAnsi="Calibri"/>
                 <w:color w:val="404040"/>
                 <w:sz w:val="17"/>
               </w:rPr>
@@ -4876,7 +4876,7 @@
           <w:p>
             <w:r>
               <w:rPr>
-                <w:rFonts w:ascii="Aptos" w:hAnsi="Aptos"/>
+                <w:rFonts w:ascii="Calibri" w:hAnsi="Calibri"/>
                 <w:color w:val="404040"/>
                 <w:sz w:val="17"/>
               </w:rPr>
@@ -4891,7 +4891,7 @@
           <w:p>
             <w:r>
               <w:rPr>
-                <w:rFonts w:ascii="Aptos" w:hAnsi="Aptos"/>
+                <w:rFonts w:ascii="Calibri" w:hAnsi="Calibri"/>
                 <w:color w:val="404040"/>
                 <w:sz w:val="17"/>
               </w:rPr>
@@ -4906,7 +4906,7 @@
           <w:p>
             <w:r>
               <w:rPr>
-                <w:rFonts w:ascii="Aptos" w:hAnsi="Aptos"/>
+                <w:rFonts w:ascii="Calibri" w:hAnsi="Calibri"/>
                 <w:color w:val="404040"/>
                 <w:sz w:val="17"/>
               </w:rPr>
@@ -4923,7 +4923,7 @@
           <w:p>
             <w:r>
               <w:rPr>
-                <w:rFonts w:ascii="Aptos" w:hAnsi="Aptos"/>
+                <w:rFonts w:ascii="Calibri" w:hAnsi="Calibri"/>
                 <w:color w:val="404040"/>
                 <w:sz w:val="17"/>
               </w:rPr>
@@ -4938,7 +4938,7 @@
           <w:p>
             <w:r>
               <w:rPr>
-                <w:rFonts w:ascii="Aptos" w:hAnsi="Aptos"/>
+                <w:rFonts w:ascii="Calibri" w:hAnsi="Calibri"/>
                 <w:color w:val="404040"/>
                 <w:sz w:val="17"/>
               </w:rPr>
@@ -4953,7 +4953,7 @@
           <w:p>
             <w:r>
               <w:rPr>
-                <w:rFonts w:ascii="Aptos" w:hAnsi="Aptos"/>
+                <w:rFonts w:ascii="Calibri" w:hAnsi="Calibri"/>
                 <w:color w:val="404040"/>
                 <w:sz w:val="17"/>
               </w:rPr>
@@ -4970,7 +4970,7 @@
           <w:p>
             <w:r>
               <w:rPr>
-                <w:rFonts w:ascii="Aptos" w:hAnsi="Aptos"/>
+                <w:rFonts w:ascii="Calibri" w:hAnsi="Calibri"/>
                 <w:color w:val="404040"/>
                 <w:sz w:val="17"/>
               </w:rPr>
@@ -4985,7 +4985,7 @@
           <w:p>
             <w:r>
               <w:rPr>
-                <w:rFonts w:ascii="Aptos" w:hAnsi="Aptos"/>
+                <w:rFonts w:ascii="Calibri" w:hAnsi="Calibri"/>
                 <w:color w:val="404040"/>
                 <w:sz w:val="17"/>
               </w:rPr>
@@ -5000,7 +5000,7 @@
           <w:p>
             <w:r>
               <w:rPr>
-                <w:rFonts w:ascii="Aptos" w:hAnsi="Aptos"/>
+                <w:rFonts w:ascii="Calibri" w:hAnsi="Calibri"/>
                 <w:color w:val="404040"/>
                 <w:sz w:val="17"/>
               </w:rPr>
@@ -5017,7 +5017,7 @@
           <w:p>
             <w:r>
               <w:rPr>
-                <w:rFonts w:ascii="Aptos" w:hAnsi="Aptos"/>
+                <w:rFonts w:ascii="Calibri" w:hAnsi="Calibri"/>
                 <w:color w:val="404040"/>
                 <w:sz w:val="17"/>
               </w:rPr>
@@ -5032,7 +5032,7 @@
           <w:p>
             <w:r>
               <w:rPr>
-                <w:rFonts w:ascii="Aptos" w:hAnsi="Aptos"/>
+                <w:rFonts w:ascii="Calibri" w:hAnsi="Calibri"/>
                 <w:color w:val="404040"/>
                 <w:sz w:val="17"/>
               </w:rPr>
@@ -5047,7 +5047,7 @@
           <w:p>
             <w:r>
               <w:rPr>
-                <w:rFonts w:ascii="Aptos" w:hAnsi="Aptos"/>
+                <w:rFonts w:ascii="Calibri" w:hAnsi="Calibri"/>
                 <w:color w:val="404040"/>
                 <w:sz w:val="17"/>
               </w:rPr>
@@ -5064,7 +5064,7 @@
           <w:p>
             <w:r>
               <w:rPr>
-                <w:rFonts w:ascii="Aptos" w:hAnsi="Aptos"/>
+                <w:rFonts w:ascii="Calibri" w:hAnsi="Calibri"/>
                 <w:color w:val="404040"/>
                 <w:sz w:val="17"/>
               </w:rPr>
@@ -5079,7 +5079,7 @@
           <w:p>
             <w:r>
               <w:rPr>
-                <w:rFonts w:ascii="Aptos" w:hAnsi="Aptos"/>
+                <w:rFonts w:ascii="Calibri" w:hAnsi="Calibri"/>
                 <w:color w:val="404040"/>
                 <w:sz w:val="17"/>
               </w:rPr>
@@ -5094,7 +5094,7 @@
           <w:p>
             <w:r>
               <w:rPr>
-                <w:rFonts w:ascii="Aptos" w:hAnsi="Aptos"/>
+                <w:rFonts w:ascii="Calibri" w:hAnsi="Calibri"/>
                 <w:color w:val="404040"/>
                 <w:sz w:val="17"/>
               </w:rPr>
@@ -5115,7 +5115,7 @@
       </w:pPr>
       <w:r>
         <w:rPr>
-          <w:rFonts w:ascii="Aptos" w:hAnsi="Aptos"/>
+          <w:rFonts w:ascii="Calibri" w:hAnsi="Calibri"/>
           <w:b w:val="0"/>
           <w:i w:val="0"/>
           <w:color w:val="404040"/>
@@ -5131,7 +5131,7 @@
       </w:pPr>
       <w:r>
         <w:rPr>
-          <w:rFonts w:ascii="Aptos" w:hAnsi="Aptos"/>
+          <w:rFonts w:ascii="Calibri" w:hAnsi="Calibri"/>
           <w:b/>
           <w:color w:val="16202A"/>
           <w:sz w:val="32"/>
@@ -5145,7 +5145,7 @@
       </w:pPr>
       <w:r>
         <w:rPr>
-          <w:rFonts w:ascii="Aptos" w:hAnsi="Aptos"/>
+          <w:rFonts w:ascii="Calibri" w:hAnsi="Calibri"/>
           <w:b w:val="0"/>
           <w:i/>
           <w:color w:val="595959"/>
@@ -5161,7 +5161,7 @@
       </w:pPr>
       <w:r>
         <w:rPr>
-          <w:rFonts w:ascii="Aptos" w:hAnsi="Aptos"/>
+          <w:rFonts w:ascii="Calibri" w:hAnsi="Calibri"/>
           <w:b/>
           <w:color w:val="16202A"/>
           <w:sz w:val="24"/>
@@ -5176,7 +5176,7 @@
       </w:pPr>
       <w:r>
         <w:rPr>
-          <w:rFonts w:ascii="Aptos" w:hAnsi="Aptos"/>
+          <w:rFonts w:ascii="Calibri" w:hAnsi="Calibri"/>
           <w:b/>
           <w:color w:val="16202A"/>
           <w:sz w:val="18"/>
@@ -5191,7 +5191,7 @@
       </w:pPr>
       <w:r>
         <w:rPr>
-          <w:rFonts w:ascii="Aptos" w:hAnsi="Aptos"/>
+          <w:rFonts w:ascii="Calibri" w:hAnsi="Calibri"/>
           <w:color w:val="404040"/>
           <w:sz w:val="17"/>
         </w:rPr>
@@ -5205,7 +5205,7 @@
       </w:pPr>
       <w:r>
         <w:rPr>
-          <w:rFonts w:ascii="Aptos" w:hAnsi="Aptos"/>
+          <w:rFonts w:ascii="Calibri" w:hAnsi="Calibri"/>
           <w:b/>
           <w:color w:val="16202A"/>
           <w:sz w:val="18"/>
@@ -5220,7 +5220,7 @@
       </w:pPr>
       <w:r>
         <w:rPr>
-          <w:rFonts w:ascii="Aptos" w:hAnsi="Aptos"/>
+          <w:rFonts w:ascii="Calibri" w:hAnsi="Calibri"/>
           <w:color w:val="404040"/>
           <w:sz w:val="17"/>
         </w:rPr>
@@ -5234,7 +5234,7 @@
       </w:pPr>
       <w:r>
         <w:rPr>
-          <w:rFonts w:ascii="Aptos" w:hAnsi="Aptos"/>
+          <w:rFonts w:ascii="Calibri" w:hAnsi="Calibri"/>
           <w:b/>
           <w:color w:val="16202A"/>
           <w:sz w:val="18"/>
@@ -5249,7 +5249,7 @@
       </w:pPr>
       <w:r>
         <w:rPr>
-          <w:rFonts w:ascii="Aptos" w:hAnsi="Aptos"/>
+          <w:rFonts w:ascii="Calibri" w:hAnsi="Calibri"/>
           <w:color w:val="404040"/>
           <w:sz w:val="17"/>
         </w:rPr>
@@ -5263,7 +5263,7 @@
       </w:pPr>
       <w:r>
         <w:rPr>
-          <w:rFonts w:ascii="Aptos" w:hAnsi="Aptos"/>
+          <w:rFonts w:ascii="Calibri" w:hAnsi="Calibri"/>
           <w:b/>
           <w:color w:val="16202A"/>
           <w:sz w:val="18"/>
@@ -5278,7 +5278,7 @@
       </w:pPr>
       <w:r>
         <w:rPr>
-          <w:rFonts w:ascii="Aptos" w:hAnsi="Aptos"/>
+          <w:rFonts w:ascii="Calibri" w:hAnsi="Calibri"/>
           <w:color w:val="404040"/>
           <w:sz w:val="17"/>
         </w:rPr>
@@ -5292,7 +5292,7 @@
       </w:pPr>
       <w:r>
         <w:rPr>
-          <w:rFonts w:ascii="Aptos" w:hAnsi="Aptos"/>
+          <w:rFonts w:ascii="Calibri" w:hAnsi="Calibri"/>
           <w:b/>
           <w:color w:val="16202A"/>
           <w:sz w:val="24"/>
@@ -5307,7 +5307,7 @@
       </w:pPr>
       <w:r>
         <w:rPr>
-          <w:rFonts w:ascii="Aptos" w:hAnsi="Aptos"/>
+          <w:rFonts w:ascii="Calibri" w:hAnsi="Calibri"/>
           <w:b/>
           <w:color w:val="16202A"/>
           <w:sz w:val="18"/>
@@ -5322,7 +5322,7 @@
       </w:pPr>
       <w:r>
         <w:rPr>
-          <w:rFonts w:ascii="Aptos" w:hAnsi="Aptos"/>
+          <w:rFonts w:ascii="Calibri" w:hAnsi="Calibri"/>
           <w:color w:val="404040"/>
           <w:sz w:val="17"/>
         </w:rPr>
@@ -5336,7 +5336,7 @@
       </w:pPr>
       <w:r>
         <w:rPr>
-          <w:rFonts w:ascii="Aptos" w:hAnsi="Aptos"/>
+          <w:rFonts w:ascii="Calibri" w:hAnsi="Calibri"/>
           <w:b/>
           <w:color w:val="16202A"/>
           <w:sz w:val="18"/>
@@ -5351,7 +5351,7 @@
       </w:pPr>
       <w:r>
         <w:rPr>
-          <w:rFonts w:ascii="Aptos" w:hAnsi="Aptos"/>
+          <w:rFonts w:ascii="Calibri" w:hAnsi="Calibri"/>
           <w:color w:val="404040"/>
           <w:sz w:val="17"/>
         </w:rPr>
@@ -5365,7 +5365,7 @@
       </w:pPr>
       <w:r>
         <w:rPr>
-          <w:rFonts w:ascii="Aptos" w:hAnsi="Aptos"/>
+          <w:rFonts w:ascii="Calibri" w:hAnsi="Calibri"/>
           <w:b/>
           <w:color w:val="16202A"/>
           <w:sz w:val="18"/>
@@ -5380,7 +5380,7 @@
       </w:pPr>
       <w:r>
         <w:rPr>
-          <w:rFonts w:ascii="Aptos" w:hAnsi="Aptos"/>
+          <w:rFonts w:ascii="Calibri" w:hAnsi="Calibri"/>
           <w:color w:val="404040"/>
           <w:sz w:val="17"/>
         </w:rPr>
@@ -5394,7 +5394,7 @@
       </w:pPr>
       <w:r>
         <w:rPr>
-          <w:rFonts w:ascii="Aptos" w:hAnsi="Aptos"/>
+          <w:rFonts w:ascii="Calibri" w:hAnsi="Calibri"/>
           <w:b/>
           <w:color w:val="16202A"/>
           <w:sz w:val="18"/>
@@ -5409,7 +5409,7 @@
       </w:pPr>
       <w:r>
         <w:rPr>
-          <w:rFonts w:ascii="Aptos" w:hAnsi="Aptos"/>
+          <w:rFonts w:ascii="Calibri" w:hAnsi="Calibri"/>
           <w:color w:val="404040"/>
           <w:sz w:val="17"/>
         </w:rPr>
@@ -5423,7 +5423,7 @@
       </w:pPr>
       <w:r>
         <w:rPr>
-          <w:rFonts w:ascii="Aptos" w:hAnsi="Aptos"/>
+          <w:rFonts w:ascii="Calibri" w:hAnsi="Calibri"/>
           <w:b/>
           <w:color w:val="16202A"/>
           <w:sz w:val="18"/>
@@ -5438,7 +5438,7 @@
       </w:pPr>
       <w:r>
         <w:rPr>
-          <w:rFonts w:ascii="Aptos" w:hAnsi="Aptos"/>
+          <w:rFonts w:ascii="Calibri" w:hAnsi="Calibri"/>
           <w:color w:val="404040"/>
           <w:sz w:val="17"/>
         </w:rPr>
@@ -5452,7 +5452,7 @@
       </w:pPr>
       <w:r>
         <w:rPr>
-          <w:rFonts w:ascii="Aptos" w:hAnsi="Aptos"/>
+          <w:rFonts w:ascii="Calibri" w:hAnsi="Calibri"/>
           <w:b/>
           <w:color w:val="16202A"/>
           <w:sz w:val="18"/>
@@ -5467,7 +5467,7 @@
       </w:pPr>
       <w:r>
         <w:rPr>
-          <w:rFonts w:ascii="Aptos" w:hAnsi="Aptos"/>
+          <w:rFonts w:ascii="Calibri" w:hAnsi="Calibri"/>
           <w:color w:val="404040"/>
           <w:sz w:val="17"/>
         </w:rPr>
@@ -5481,7 +5481,7 @@
       </w:pPr>
       <w:r>
         <w:rPr>
-          <w:rFonts w:ascii="Aptos" w:hAnsi="Aptos"/>
+          <w:rFonts w:ascii="Calibri" w:hAnsi="Calibri"/>
           <w:b/>
           <w:color w:val="16202A"/>
           <w:sz w:val="18"/>
@@ -5496,7 +5496,7 @@
       </w:pPr>
       <w:r>
         <w:rPr>
-          <w:rFonts w:ascii="Aptos" w:hAnsi="Aptos"/>
+          <w:rFonts w:ascii="Calibri" w:hAnsi="Calibri"/>
           <w:color w:val="404040"/>
           <w:sz w:val="17"/>
         </w:rPr>
@@ -5510,7 +5510,7 @@
       </w:pPr>
       <w:r>
         <w:rPr>
-          <w:rFonts w:ascii="Aptos" w:hAnsi="Aptos"/>
+          <w:rFonts w:ascii="Calibri" w:hAnsi="Calibri"/>
           <w:b/>
           <w:color w:val="16202A"/>
           <w:sz w:val="18"/>
@@ -5525,7 +5525,7 @@
       </w:pPr>
       <w:r>
         <w:rPr>
-          <w:rFonts w:ascii="Aptos" w:hAnsi="Aptos"/>
+          <w:rFonts w:ascii="Calibri" w:hAnsi="Calibri"/>
           <w:color w:val="404040"/>
           <w:sz w:val="17"/>
         </w:rPr>
@@ -5539,7 +5539,7 @@
       </w:pPr>
       <w:r>
         <w:rPr>
-          <w:rFonts w:ascii="Aptos" w:hAnsi="Aptos"/>
+          <w:rFonts w:ascii="Calibri" w:hAnsi="Calibri"/>
           <w:b/>
           <w:color w:val="16202A"/>
           <w:sz w:val="18"/>
@@ -5554,7 +5554,7 @@
       </w:pPr>
       <w:r>
         <w:rPr>
-          <w:rFonts w:ascii="Aptos" w:hAnsi="Aptos"/>
+          <w:rFonts w:ascii="Calibri" w:hAnsi="Calibri"/>
           <w:color w:val="404040"/>
           <w:sz w:val="17"/>
         </w:rPr>
@@ -5568,7 +5568,7 @@
       </w:pPr>
       <w:r>
         <w:rPr>
-          <w:rFonts w:ascii="Aptos" w:hAnsi="Aptos"/>
+          <w:rFonts w:ascii="Calibri" w:hAnsi="Calibri"/>
           <w:b/>
           <w:color w:val="16202A"/>
           <w:sz w:val="24"/>
@@ -5583,7 +5583,7 @@
       </w:pPr>
       <w:r>
         <w:rPr>
-          <w:rFonts w:ascii="Aptos" w:hAnsi="Aptos"/>
+          <w:rFonts w:ascii="Calibri" w:hAnsi="Calibri"/>
           <w:b/>
           <w:color w:val="16202A"/>
           <w:sz w:val="18"/>
@@ -5598,7 +5598,7 @@
       </w:pPr>
       <w:r>
         <w:rPr>
-          <w:rFonts w:ascii="Aptos" w:hAnsi="Aptos"/>
+          <w:rFonts w:ascii="Calibri" w:hAnsi="Calibri"/>
           <w:color w:val="404040"/>
           <w:sz w:val="17"/>
         </w:rPr>
@@ -5612,7 +5612,7 @@
       </w:pPr>
       <w:r>
         <w:rPr>
-          <w:rFonts w:ascii="Aptos" w:hAnsi="Aptos"/>
+          <w:rFonts w:ascii="Calibri" w:hAnsi="Calibri"/>
           <w:b/>
           <w:color w:val="16202A"/>
           <w:sz w:val="18"/>
@@ -5627,7 +5627,7 @@
       </w:pPr>
       <w:r>
         <w:rPr>
-          <w:rFonts w:ascii="Aptos" w:hAnsi="Aptos"/>
+          <w:rFonts w:ascii="Calibri" w:hAnsi="Calibri"/>
           <w:color w:val="404040"/>
           <w:sz w:val="17"/>
         </w:rPr>
@@ -5641,7 +5641,7 @@
       </w:pPr>
       <w:r>
         <w:rPr>
-          <w:rFonts w:ascii="Aptos" w:hAnsi="Aptos"/>
+          <w:rFonts w:ascii="Calibri" w:hAnsi="Calibri"/>
           <w:b/>
           <w:color w:val="16202A"/>
           <w:sz w:val="18"/>
@@ -5656,7 +5656,7 @@
       </w:pPr>
       <w:r>
         <w:rPr>
-          <w:rFonts w:ascii="Aptos" w:hAnsi="Aptos"/>
+          <w:rFonts w:ascii="Calibri" w:hAnsi="Calibri"/>
           <w:color w:val="404040"/>
           <w:sz w:val="17"/>
         </w:rPr>
@@ -5670,7 +5670,7 @@
       </w:pPr>
       <w:r>
         <w:rPr>
-          <w:rFonts w:ascii="Aptos" w:hAnsi="Aptos"/>
+          <w:rFonts w:ascii="Calibri" w:hAnsi="Calibri"/>
           <w:b/>
           <w:color w:val="16202A"/>
           <w:sz w:val="18"/>
@@ -5685,7 +5685,7 @@
       </w:pPr>
       <w:r>
         <w:rPr>
-          <w:rFonts w:ascii="Aptos" w:hAnsi="Aptos"/>
+          <w:rFonts w:ascii="Calibri" w:hAnsi="Calibri"/>
           <w:color w:val="404040"/>
           <w:sz w:val="17"/>
         </w:rPr>
@@ -5699,7 +5699,7 @@
       </w:pPr>
       <w:r>
         <w:rPr>
-          <w:rFonts w:ascii="Aptos" w:hAnsi="Aptos"/>
+          <w:rFonts w:ascii="Calibri" w:hAnsi="Calibri"/>
           <w:b/>
           <w:color w:val="16202A"/>
           <w:sz w:val="18"/>
@@ -5714,7 +5714,7 @@
       </w:pPr>
       <w:r>
         <w:rPr>
-          <w:rFonts w:ascii="Aptos" w:hAnsi="Aptos"/>
+          <w:rFonts w:ascii="Calibri" w:hAnsi="Calibri"/>
           <w:color w:val="404040"/>
           <w:sz w:val="17"/>
         </w:rPr>
@@ -5728,7 +5728,7 @@
       </w:pPr>
       <w:r>
         <w:rPr>
-          <w:rFonts w:ascii="Aptos" w:hAnsi="Aptos"/>
+          <w:rFonts w:ascii="Calibri" w:hAnsi="Calibri"/>
           <w:b/>
           <w:color w:val="16202A"/>
           <w:sz w:val="24"/>
@@ -5743,7 +5743,7 @@
       </w:pPr>
       <w:r>
         <w:rPr>
-          <w:rFonts w:ascii="Aptos" w:hAnsi="Aptos"/>
+          <w:rFonts w:ascii="Calibri" w:hAnsi="Calibri"/>
           <w:b/>
           <w:color w:val="16202A"/>
           <w:sz w:val="18"/>
@@ -5758,7 +5758,7 @@
       </w:pPr>
       <w:r>
         <w:rPr>
-          <w:rFonts w:ascii="Aptos" w:hAnsi="Aptos"/>
+          <w:rFonts w:ascii="Calibri" w:hAnsi="Calibri"/>
           <w:color w:val="404040"/>
           <w:sz w:val="17"/>
         </w:rPr>
@@ -5772,7 +5772,7 @@
       </w:pPr>
       <w:r>
         <w:rPr>
-          <w:rFonts w:ascii="Aptos" w:hAnsi="Aptos"/>
+          <w:rFonts w:ascii="Calibri" w:hAnsi="Calibri"/>
           <w:b/>
           <w:color w:val="16202A"/>
           <w:sz w:val="18"/>
@@ -5787,7 +5787,7 @@
       </w:pPr>
       <w:r>
         <w:rPr>
-          <w:rFonts w:ascii="Aptos" w:hAnsi="Aptos"/>
+          <w:rFonts w:ascii="Calibri" w:hAnsi="Calibri"/>
           <w:color w:val="404040"/>
           <w:sz w:val="17"/>
         </w:rPr>
@@ -5801,7 +5801,7 @@
       </w:pPr>
       <w:r>
         <w:rPr>
-          <w:rFonts w:ascii="Aptos" w:hAnsi="Aptos"/>
+          <w:rFonts w:ascii="Calibri" w:hAnsi="Calibri"/>
           <w:b/>
           <w:color w:val="16202A"/>
           <w:sz w:val="18"/>
@@ -5816,7 +5816,7 @@
       </w:pPr>
       <w:r>
         <w:rPr>
-          <w:rFonts w:ascii="Aptos" w:hAnsi="Aptos"/>
+          <w:rFonts w:ascii="Calibri" w:hAnsi="Calibri"/>
           <w:color w:val="404040"/>
           <w:sz w:val="17"/>
         </w:rPr>
@@ -5830,7 +5830,7 @@
       </w:pPr>
       <w:r>
         <w:rPr>
-          <w:rFonts w:ascii="Aptos" w:hAnsi="Aptos"/>
+          <w:rFonts w:ascii="Calibri" w:hAnsi="Calibri"/>
           <w:b/>
           <w:color w:val="16202A"/>
           <w:sz w:val="18"/>
@@ -5845,7 +5845,7 @@
       </w:pPr>
       <w:r>
         <w:rPr>
-          <w:rFonts w:ascii="Aptos" w:hAnsi="Aptos"/>
+          <w:rFonts w:ascii="Calibri" w:hAnsi="Calibri"/>
           <w:color w:val="404040"/>
           <w:sz w:val="17"/>
         </w:rPr>
@@ -5859,7 +5859,7 @@
       </w:pPr>
       <w:r>
         <w:rPr>
-          <w:rFonts w:ascii="Aptos" w:hAnsi="Aptos"/>
+          <w:rFonts w:ascii="Calibri" w:hAnsi="Calibri"/>
           <w:b/>
           <w:color w:val="16202A"/>
           <w:sz w:val="18"/>
@@ -5874,7 +5874,7 @@
       </w:pPr>
       <w:r>
         <w:rPr>
-          <w:rFonts w:ascii="Aptos" w:hAnsi="Aptos"/>
+          <w:rFonts w:ascii="Calibri" w:hAnsi="Calibri"/>
           <w:color w:val="404040"/>
           <w:sz w:val="17"/>
         </w:rPr>
@@ -5888,7 +5888,7 @@
       </w:pPr>
       <w:r>
         <w:rPr>
-          <w:rFonts w:ascii="Aptos" w:hAnsi="Aptos"/>
+          <w:rFonts w:ascii="Calibri" w:hAnsi="Calibri"/>
           <w:b/>
           <w:color w:val="16202A"/>
           <w:sz w:val="18"/>
@@ -5903,7 +5903,7 @@
       </w:pPr>
       <w:r>
         <w:rPr>
-          <w:rFonts w:ascii="Aptos" w:hAnsi="Aptos"/>
+          <w:rFonts w:ascii="Calibri" w:hAnsi="Calibri"/>
           <w:color w:val="404040"/>
           <w:sz w:val="17"/>
         </w:rPr>
@@ -5917,7 +5917,7 @@
       </w:pPr>
       <w:r>
         <w:rPr>
-          <w:rFonts w:ascii="Aptos" w:hAnsi="Aptos"/>
+          <w:rFonts w:ascii="Calibri" w:hAnsi="Calibri"/>
           <w:b/>
           <w:color w:val="16202A"/>
           <w:sz w:val="18"/>
@@ -5932,7 +5932,7 @@
       </w:pPr>
       <w:r>
         <w:rPr>
-          <w:rFonts w:ascii="Aptos" w:hAnsi="Aptos"/>
+          <w:rFonts w:ascii="Calibri" w:hAnsi="Calibri"/>
           <w:color w:val="404040"/>
           <w:sz w:val="17"/>
         </w:rPr>
@@ -5946,7 +5946,7 @@
       </w:pPr>
       <w:r>
         <w:rPr>
-          <w:rFonts w:ascii="Aptos" w:hAnsi="Aptos"/>
+          <w:rFonts w:ascii="Calibri" w:hAnsi="Calibri"/>
           <w:b/>
           <w:color w:val="16202A"/>
           <w:sz w:val="24"/>
@@ -5961,7 +5961,7 @@
       </w:pPr>
       <w:r>
         <w:rPr>
-          <w:rFonts w:ascii="Aptos" w:hAnsi="Aptos"/>
+          <w:rFonts w:ascii="Calibri" w:hAnsi="Calibri"/>
           <w:b/>
           <w:color w:val="16202A"/>
           <w:sz w:val="18"/>
@@ -5976,7 +5976,7 @@
       </w:pPr>
       <w:r>
         <w:rPr>
-          <w:rFonts w:ascii="Aptos" w:hAnsi="Aptos"/>
+          <w:rFonts w:ascii="Calibri" w:hAnsi="Calibri"/>
           <w:color w:val="404040"/>
           <w:sz w:val="17"/>
         </w:rPr>
@@ -5990,7 +5990,7 @@
       </w:pPr>
       <w:r>
         <w:rPr>
-          <w:rFonts w:ascii="Aptos" w:hAnsi="Aptos"/>
+          <w:rFonts w:ascii="Calibri" w:hAnsi="Calibri"/>
           <w:b/>
           <w:color w:val="16202A"/>
           <w:sz w:val="18"/>
@@ -6005,7 +6005,7 @@
       </w:pPr>
       <w:r>
         <w:rPr>
-          <w:rFonts w:ascii="Aptos" w:hAnsi="Aptos"/>
+          <w:rFonts w:ascii="Calibri" w:hAnsi="Calibri"/>
           <w:color w:val="404040"/>
           <w:sz w:val="17"/>
         </w:rPr>
@@ -6019,7 +6019,7 @@
       </w:pPr>
       <w:r>
         <w:rPr>
-          <w:rFonts w:ascii="Aptos" w:hAnsi="Aptos"/>
+          <w:rFonts w:ascii="Calibri" w:hAnsi="Calibri"/>
           <w:b/>
           <w:color w:val="16202A"/>
           <w:sz w:val="18"/>
@@ -6034,7 +6034,7 @@
       </w:pPr>
       <w:r>
         <w:rPr>
-          <w:rFonts w:ascii="Aptos" w:hAnsi="Aptos"/>
+          <w:rFonts w:ascii="Calibri" w:hAnsi="Calibri"/>
           <w:color w:val="404040"/>
           <w:sz w:val="17"/>
         </w:rPr>
@@ -6048,7 +6048,7 @@
       </w:pPr>
       <w:r>
         <w:rPr>
-          <w:rFonts w:ascii="Aptos" w:hAnsi="Aptos"/>
+          <w:rFonts w:ascii="Calibri" w:hAnsi="Calibri"/>
           <w:b/>
           <w:color w:val="16202A"/>
           <w:sz w:val="18"/>
@@ -6063,7 +6063,7 @@
       </w:pPr>
       <w:r>
         <w:rPr>
-          <w:rFonts w:ascii="Aptos" w:hAnsi="Aptos"/>
+          <w:rFonts w:ascii="Calibri" w:hAnsi="Calibri"/>
           <w:color w:val="404040"/>
           <w:sz w:val="17"/>
         </w:rPr>
@@ -6077,7 +6077,7 @@
       </w:pPr>
       <w:r>
         <w:rPr>
-          <w:rFonts w:ascii="Aptos" w:hAnsi="Aptos"/>
+          <w:rFonts w:ascii="Calibri" w:hAnsi="Calibri"/>
           <w:b/>
           <w:color w:val="16202A"/>
           <w:sz w:val="18"/>
@@ -6092,7 +6092,7 @@
       </w:pPr>
       <w:r>
         <w:rPr>
-          <w:rFonts w:ascii="Aptos" w:hAnsi="Aptos"/>
+          <w:rFonts w:ascii="Calibri" w:hAnsi="Calibri"/>
           <w:color w:val="404040"/>
           <w:sz w:val="17"/>
         </w:rPr>
@@ -6106,7 +6106,7 @@
       </w:pPr>
       <w:r>
         <w:rPr>
-          <w:rFonts w:ascii="Aptos" w:hAnsi="Aptos"/>
+          <w:rFonts w:ascii="Calibri" w:hAnsi="Calibri"/>
           <w:b/>
           <w:color w:val="16202A"/>
           <w:sz w:val="18"/>
@@ -6121,7 +6121,7 @@
       </w:pPr>
       <w:r>
         <w:rPr>
-          <w:rFonts w:ascii="Aptos" w:hAnsi="Aptos"/>
+          <w:rFonts w:ascii="Calibri" w:hAnsi="Calibri"/>
           <w:color w:val="404040"/>
           <w:sz w:val="17"/>
         </w:rPr>
@@ -6135,7 +6135,7 @@
       </w:pPr>
       <w:r>
         <w:rPr>
-          <w:rFonts w:ascii="Aptos" w:hAnsi="Aptos"/>
+          <w:rFonts w:ascii="Calibri" w:hAnsi="Calibri"/>
           <w:b/>
           <w:color w:val="16202A"/>
           <w:sz w:val="24"/>
@@ -6150,7 +6150,7 @@
       </w:pPr>
       <w:r>
         <w:rPr>
-          <w:rFonts w:ascii="Aptos" w:hAnsi="Aptos"/>
+          <w:rFonts w:ascii="Calibri" w:hAnsi="Calibri"/>
           <w:b/>
           <w:color w:val="16202A"/>
           <w:sz w:val="18"/>
@@ -6165,7 +6165,7 @@
       </w:pPr>
       <w:r>
         <w:rPr>
-          <w:rFonts w:ascii="Aptos" w:hAnsi="Aptos"/>
+          <w:rFonts w:ascii="Calibri" w:hAnsi="Calibri"/>
           <w:color w:val="404040"/>
           <w:sz w:val="17"/>
         </w:rPr>
@@ -6179,7 +6179,7 @@
       </w:pPr>
       <w:r>
         <w:rPr>
-          <w:rFonts w:ascii="Aptos" w:hAnsi="Aptos"/>
+          <w:rFonts w:ascii="Calibri" w:hAnsi="Calibri"/>
           <w:b/>
           <w:color w:val="16202A"/>
           <w:sz w:val="18"/>
@@ -6194,7 +6194,7 @@
       </w:pPr>
       <w:r>
         <w:rPr>
-          <w:rFonts w:ascii="Aptos" w:hAnsi="Aptos"/>
+          <w:rFonts w:ascii="Calibri" w:hAnsi="Calibri"/>
           <w:color w:val="404040"/>
           <w:sz w:val="17"/>
         </w:rPr>
@@ -6208,7 +6208,7 @@
       </w:pPr>
       <w:r>
         <w:rPr>
-          <w:rFonts w:ascii="Aptos" w:hAnsi="Aptos"/>
+          <w:rFonts w:ascii="Calibri" w:hAnsi="Calibri"/>
           <w:b/>
           <w:color w:val="16202A"/>
           <w:sz w:val="18"/>
@@ -6223,7 +6223,7 @@
       </w:pPr>
       <w:r>
         <w:rPr>
-          <w:rFonts w:ascii="Aptos" w:hAnsi="Aptos"/>
+          <w:rFonts w:ascii="Calibri" w:hAnsi="Calibri"/>
           <w:color w:val="404040"/>
           <w:sz w:val="17"/>
         </w:rPr>
@@ -6237,7 +6237,7 @@
       </w:pPr>
       <w:r>
         <w:rPr>
-          <w:rFonts w:ascii="Aptos" w:hAnsi="Aptos"/>
+          <w:rFonts w:ascii="Calibri" w:hAnsi="Calibri"/>
           <w:b/>
           <w:color w:val="16202A"/>
           <w:sz w:val="18"/>
@@ -6252,7 +6252,7 @@
       </w:pPr>
       <w:r>
         <w:rPr>
-          <w:rFonts w:ascii="Aptos" w:hAnsi="Aptos"/>
+          <w:rFonts w:ascii="Calibri" w:hAnsi="Calibri"/>
           <w:color w:val="404040"/>
           <w:sz w:val="17"/>
         </w:rPr>
@@ -6266,7 +6266,7 @@
       </w:pPr>
       <w:r>
         <w:rPr>
-          <w:rFonts w:ascii="Aptos" w:hAnsi="Aptos"/>
+          <w:rFonts w:ascii="Calibri" w:hAnsi="Calibri"/>
           <w:b/>
           <w:color w:val="16202A"/>
           <w:sz w:val="18"/>
@@ -6281,7 +6281,7 @@
       </w:pPr>
       <w:r>
         <w:rPr>
-          <w:rFonts w:ascii="Aptos" w:hAnsi="Aptos"/>
+          <w:rFonts w:ascii="Calibri" w:hAnsi="Calibri"/>
           <w:color w:val="404040"/>
           <w:sz w:val="17"/>
         </w:rPr>
@@ -6295,7 +6295,7 @@
       </w:pPr>
       <w:r>
         <w:rPr>
-          <w:rFonts w:ascii="Aptos" w:hAnsi="Aptos"/>
+          <w:rFonts w:ascii="Calibri" w:hAnsi="Calibri"/>
           <w:b/>
           <w:color w:val="16202A"/>
           <w:sz w:val="24"/>
@@ -6310,7 +6310,7 @@
       </w:pPr>
       <w:r>
         <w:rPr>
-          <w:rFonts w:ascii="Aptos" w:hAnsi="Aptos"/>
+          <w:rFonts w:ascii="Calibri" w:hAnsi="Calibri"/>
           <w:b/>
           <w:color w:val="16202A"/>
           <w:sz w:val="18"/>
@@ -6325,7 +6325,7 @@
       </w:pPr>
       <w:r>
         <w:rPr>
-          <w:rFonts w:ascii="Aptos" w:hAnsi="Aptos"/>
+          <w:rFonts w:ascii="Calibri" w:hAnsi="Calibri"/>
           <w:color w:val="404040"/>
           <w:sz w:val="17"/>
         </w:rPr>
@@ -6339,7 +6339,7 @@
       </w:pPr>
       <w:r>
         <w:rPr>
-          <w:rFonts w:ascii="Aptos" w:hAnsi="Aptos"/>
+          <w:rFonts w:ascii="Calibri" w:hAnsi="Calibri"/>
           <w:b/>
           <w:color w:val="16202A"/>
           <w:sz w:val="18"/>
@@ -6354,7 +6354,7 @@
       </w:pPr>
       <w:r>
         <w:rPr>
-          <w:rFonts w:ascii="Aptos" w:hAnsi="Aptos"/>
+          <w:rFonts w:ascii="Calibri" w:hAnsi="Calibri"/>
           <w:color w:val="404040"/>
           <w:sz w:val="17"/>
         </w:rPr>
@@ -6368,7 +6368,7 @@
       </w:pPr>
       <w:r>
         <w:rPr>
-          <w:rFonts w:ascii="Aptos" w:hAnsi="Aptos"/>
+          <w:rFonts w:ascii="Calibri" w:hAnsi="Calibri"/>
           <w:b/>
           <w:color w:val="16202A"/>
           <w:sz w:val="18"/>
@@ -6383,7 +6383,7 @@
       </w:pPr>
       <w:r>
         <w:rPr>
-          <w:rFonts w:ascii="Aptos" w:hAnsi="Aptos"/>
+          <w:rFonts w:ascii="Calibri" w:hAnsi="Calibri"/>
           <w:color w:val="404040"/>
           <w:sz w:val="17"/>
         </w:rPr>
@@ -6397,7 +6397,7 @@
       </w:pPr>
       <w:r>
         <w:rPr>
-          <w:rFonts w:ascii="Aptos" w:hAnsi="Aptos"/>
+          <w:rFonts w:ascii="Calibri" w:hAnsi="Calibri"/>
           <w:b/>
           <w:color w:val="16202A"/>
           <w:sz w:val="18"/>
@@ -6412,7 +6412,7 @@
       </w:pPr>
       <w:r>
         <w:rPr>
-          <w:rFonts w:ascii="Aptos" w:hAnsi="Aptos"/>
+          <w:rFonts w:ascii="Calibri" w:hAnsi="Calibri"/>
           <w:color w:val="404040"/>
           <w:sz w:val="17"/>
         </w:rPr>
@@ -6426,7 +6426,7 @@
       </w:pPr>
       <w:r>
         <w:rPr>
-          <w:rFonts w:ascii="Aptos" w:hAnsi="Aptos"/>
+          <w:rFonts w:ascii="Calibri" w:hAnsi="Calibri"/>
           <w:b/>
           <w:color w:val="16202A"/>
           <w:sz w:val="24"/>
@@ -6441,7 +6441,7 @@
       </w:pPr>
       <w:r>
         <w:rPr>
-          <w:rFonts w:ascii="Aptos" w:hAnsi="Aptos"/>
+          <w:rFonts w:ascii="Calibri" w:hAnsi="Calibri"/>
           <w:b/>
           <w:color w:val="16202A"/>
           <w:sz w:val="18"/>
@@ -6456,7 +6456,7 @@
       </w:pPr>
       <w:r>
         <w:rPr>
-          <w:rFonts w:ascii="Aptos" w:hAnsi="Aptos"/>
+          <w:rFonts w:ascii="Calibri" w:hAnsi="Calibri"/>
           <w:color w:val="404040"/>
           <w:sz w:val="17"/>
         </w:rPr>
@@ -6470,7 +6470,7 @@
       </w:pPr>
       <w:r>
         <w:rPr>
-          <w:rFonts w:ascii="Aptos" w:hAnsi="Aptos"/>
+          <w:rFonts w:ascii="Calibri" w:hAnsi="Calibri"/>
           <w:b/>
           <w:color w:val="16202A"/>
           <w:sz w:val="18"/>
@@ -6485,7 +6485,7 @@
       </w:pPr>
       <w:r>
         <w:rPr>
-          <w:rFonts w:ascii="Aptos" w:hAnsi="Aptos"/>
+          <w:rFonts w:ascii="Calibri" w:hAnsi="Calibri"/>
           <w:color w:val="404040"/>
           <w:sz w:val="17"/>
         </w:rPr>
@@ -6499,7 +6499,7 @@
       </w:pPr>
       <w:r>
         <w:rPr>
-          <w:rFonts w:ascii="Aptos" w:hAnsi="Aptos"/>
+          <w:rFonts w:ascii="Calibri" w:hAnsi="Calibri"/>
           <w:b/>
           <w:color w:val="16202A"/>
           <w:sz w:val="18"/>
@@ -6514,7 +6514,7 @@
       </w:pPr>
       <w:r>
         <w:rPr>
-          <w:rFonts w:ascii="Aptos" w:hAnsi="Aptos"/>
+          <w:rFonts w:ascii="Calibri" w:hAnsi="Calibri"/>
           <w:color w:val="404040"/>
           <w:sz w:val="17"/>
         </w:rPr>
@@ -6528,7 +6528,7 @@
       </w:pPr>
       <w:r>
         <w:rPr>
-          <w:rFonts w:ascii="Aptos" w:hAnsi="Aptos"/>
+          <w:rFonts w:ascii="Calibri" w:hAnsi="Calibri"/>
           <w:b/>
           <w:color w:val="16202A"/>
           <w:sz w:val="18"/>
@@ -6543,7 +6543,7 @@
       </w:pPr>
       <w:r>
         <w:rPr>
-          <w:rFonts w:ascii="Aptos" w:hAnsi="Aptos"/>
+          <w:rFonts w:ascii="Calibri" w:hAnsi="Calibri"/>
           <w:color w:val="404040"/>
           <w:sz w:val="17"/>
         </w:rPr>
@@ -6557,7 +6557,7 @@
       </w:pPr>
       <w:r>
         <w:rPr>
-          <w:rFonts w:ascii="Aptos" w:hAnsi="Aptos"/>
+          <w:rFonts w:ascii="Calibri" w:hAnsi="Calibri"/>
           <w:b/>
           <w:color w:val="16202A"/>
           <w:sz w:val="32"/>
@@ -6571,7 +6571,7 @@
       </w:pPr>
       <w:r>
         <w:rPr>
-          <w:rFonts w:ascii="Aptos" w:hAnsi="Aptos"/>
+          <w:rFonts w:ascii="Calibri" w:hAnsi="Calibri"/>
           <w:i/>
           <w:color w:val="404040"/>
           <w:sz w:val="20"/>
@@ -6585,7 +6585,7 @@
       </w:pPr>
       <w:r>
         <w:rPr>
-          <w:rFonts w:ascii="Aptos" w:hAnsi="Aptos"/>
+          <w:rFonts w:ascii="Calibri" w:hAnsi="Calibri"/>
           <w:i/>
           <w:color w:val="404040"/>
           <w:sz w:val="20"/>
@@ -6599,7 +6599,7 @@
       </w:pPr>
       <w:r>
         <w:rPr>
-          <w:rFonts w:ascii="Aptos" w:hAnsi="Aptos"/>
+          <w:rFonts w:ascii="Calibri" w:hAnsi="Calibri"/>
           <w:i/>
           <w:color w:val="404040"/>
           <w:sz w:val="20"/>
@@ -6613,7 +6613,7 @@
       </w:pPr>
       <w:r>
         <w:rPr>
-          <w:rFonts w:ascii="Aptos" w:hAnsi="Aptos"/>
+          <w:rFonts w:ascii="Calibri" w:hAnsi="Calibri"/>
           <w:i/>
           <w:color w:val="404040"/>
           <w:sz w:val="20"/>
@@ -6628,7 +6628,7 @@
       </w:pPr>
       <w:r>
         <w:rPr>
-          <w:rFonts w:ascii="Aptos" w:hAnsi="Aptos"/>
+          <w:rFonts w:ascii="Calibri" w:hAnsi="Calibri"/>
           <w:b/>
           <w:color w:val="16202A"/>
           <w:sz w:val="32"/>
@@ -6642,7 +6642,7 @@
       </w:pPr>
       <w:r>
         <w:rPr>
-          <w:rFonts w:ascii="Aptos" w:hAnsi="Aptos"/>
+          <w:rFonts w:ascii="Calibri" w:hAnsi="Calibri"/>
           <w:b/>
           <w:i w:val="0"/>
           <w:color w:val="16202A"/>
@@ -6675,7 +6675,7 @@
             </w:pPr>
             <w:r>
               <w:rPr>
-                <w:rFonts w:ascii="Aptos" w:hAnsi="Aptos"/>
+                <w:rFonts w:ascii="Calibri" w:hAnsi="Calibri"/>
                 <w:b/>
                 <w:color w:val="FFFFFF"/>
                 <w:sz w:val="18"/>
@@ -6695,7 +6695,7 @@
             </w:pPr>
             <w:r>
               <w:rPr>
-                <w:rFonts w:ascii="Aptos" w:hAnsi="Aptos"/>
+                <w:rFonts w:ascii="Calibri" w:hAnsi="Calibri"/>
                 <w:b/>
                 <w:color w:val="FFFFFF"/>
                 <w:sz w:val="18"/>
@@ -6713,7 +6713,7 @@
           <w:p>
             <w:r>
               <w:rPr>
-                <w:rFonts w:ascii="Aptos" w:hAnsi="Aptos"/>
+                <w:rFonts w:ascii="Calibri" w:hAnsi="Calibri"/>
                 <w:color w:val="404040"/>
                 <w:sz w:val="17"/>
               </w:rPr>
@@ -6728,7 +6728,7 @@
           <w:p>
             <w:r>
               <w:rPr>
-                <w:rFonts w:ascii="Aptos" w:hAnsi="Aptos"/>
+                <w:rFonts w:ascii="Calibri" w:hAnsi="Calibri"/>
                 <w:color w:val="404040"/>
                 <w:sz w:val="17"/>
               </w:rPr>
@@ -6745,7 +6745,7 @@
           <w:p>
             <w:r>
               <w:rPr>
-                <w:rFonts w:ascii="Aptos" w:hAnsi="Aptos"/>
+                <w:rFonts w:ascii="Calibri" w:hAnsi="Calibri"/>
                 <w:color w:val="404040"/>
                 <w:sz w:val="17"/>
               </w:rPr>
@@ -6760,7 +6760,7 @@
           <w:p>
             <w:r>
               <w:rPr>
-                <w:rFonts w:ascii="Aptos" w:hAnsi="Aptos"/>
+                <w:rFonts w:ascii="Calibri" w:hAnsi="Calibri"/>
                 <w:color w:val="404040"/>
                 <w:sz w:val="17"/>
               </w:rPr>
@@ -6777,7 +6777,7 @@
           <w:p>
             <w:r>
               <w:rPr>
-                <w:rFonts w:ascii="Aptos" w:hAnsi="Aptos"/>
+                <w:rFonts w:ascii="Calibri" w:hAnsi="Calibri"/>
                 <w:color w:val="404040"/>
                 <w:sz w:val="17"/>
               </w:rPr>
@@ -6792,7 +6792,7 @@
           <w:p>
             <w:r>
               <w:rPr>
-                <w:rFonts w:ascii="Aptos" w:hAnsi="Aptos"/>
+                <w:rFonts w:ascii="Calibri" w:hAnsi="Calibri"/>
                 <w:color w:val="404040"/>
                 <w:sz w:val="17"/>
               </w:rPr>
@@ -6809,7 +6809,7 @@
           <w:p>
             <w:r>
               <w:rPr>
-                <w:rFonts w:ascii="Aptos" w:hAnsi="Aptos"/>
+                <w:rFonts w:ascii="Calibri" w:hAnsi="Calibri"/>
                 <w:color w:val="404040"/>
                 <w:sz w:val="17"/>
               </w:rPr>
@@ -6824,7 +6824,7 @@
           <w:p>
             <w:r>
               <w:rPr>
-                <w:rFonts w:ascii="Aptos" w:hAnsi="Aptos"/>
+                <w:rFonts w:ascii="Calibri" w:hAnsi="Calibri"/>
                 <w:color w:val="404040"/>
                 <w:sz w:val="17"/>
               </w:rPr>
@@ -6841,7 +6841,7 @@
           <w:p>
             <w:r>
               <w:rPr>
-                <w:rFonts w:ascii="Aptos" w:hAnsi="Aptos"/>
+                <w:rFonts w:ascii="Calibri" w:hAnsi="Calibri"/>
                 <w:color w:val="404040"/>
                 <w:sz w:val="17"/>
               </w:rPr>
@@ -6856,7 +6856,7 @@
           <w:p>
             <w:r>
               <w:rPr>
-                <w:rFonts w:ascii="Aptos" w:hAnsi="Aptos"/>
+                <w:rFonts w:ascii="Calibri" w:hAnsi="Calibri"/>
                 <w:color w:val="404040"/>
                 <w:sz w:val="17"/>
               </w:rPr>
@@ -6873,7 +6873,7 @@
           <w:p>
             <w:r>
               <w:rPr>
-                <w:rFonts w:ascii="Aptos" w:hAnsi="Aptos"/>
+                <w:rFonts w:ascii="Calibri" w:hAnsi="Calibri"/>
                 <w:color w:val="404040"/>
                 <w:sz w:val="17"/>
               </w:rPr>
@@ -6888,7 +6888,7 @@
           <w:p>
             <w:r>
               <w:rPr>
-                <w:rFonts w:ascii="Aptos" w:hAnsi="Aptos"/>
+                <w:rFonts w:ascii="Calibri" w:hAnsi="Calibri"/>
                 <w:color w:val="404040"/>
                 <w:sz w:val="17"/>
               </w:rPr>
@@ -6905,7 +6905,7 @@
           <w:p>
             <w:r>
               <w:rPr>
-                <w:rFonts w:ascii="Aptos" w:hAnsi="Aptos"/>
+                <w:rFonts w:ascii="Calibri" w:hAnsi="Calibri"/>
                 <w:color w:val="404040"/>
                 <w:sz w:val="17"/>
               </w:rPr>
@@ -6920,7 +6920,7 @@
           <w:p>
             <w:r>
               <w:rPr>
-                <w:rFonts w:ascii="Aptos" w:hAnsi="Aptos"/>
+                <w:rFonts w:ascii="Calibri" w:hAnsi="Calibri"/>
                 <w:color w:val="404040"/>
                 <w:sz w:val="17"/>
               </w:rPr>
@@ -6937,7 +6937,7 @@
           <w:p>
             <w:r>
               <w:rPr>
-                <w:rFonts w:ascii="Aptos" w:hAnsi="Aptos"/>
+                <w:rFonts w:ascii="Calibri" w:hAnsi="Calibri"/>
                 <w:color w:val="404040"/>
                 <w:sz w:val="17"/>
               </w:rPr>
@@ -6952,7 +6952,7 @@
           <w:p>
             <w:r>
               <w:rPr>
-                <w:rFonts w:ascii="Aptos" w:hAnsi="Aptos"/>
+                <w:rFonts w:ascii="Calibri" w:hAnsi="Calibri"/>
                 <w:color w:val="404040"/>
                 <w:sz w:val="17"/>
               </w:rPr>
@@ -6969,7 +6969,7 @@
           <w:p>
             <w:r>
               <w:rPr>
-                <w:rFonts w:ascii="Aptos" w:hAnsi="Aptos"/>
+                <w:rFonts w:ascii="Calibri" w:hAnsi="Calibri"/>
                 <w:color w:val="404040"/>
                 <w:sz w:val="17"/>
               </w:rPr>
@@ -6984,7 +6984,7 @@
           <w:p>
             <w:r>
               <w:rPr>
-                <w:rFonts w:ascii="Aptos" w:hAnsi="Aptos"/>
+                <w:rFonts w:ascii="Calibri" w:hAnsi="Calibri"/>
                 <w:color w:val="404040"/>
                 <w:sz w:val="17"/>
               </w:rPr>
@@ -7001,7 +7001,7 @@
           <w:p>
             <w:r>
               <w:rPr>
-                <w:rFonts w:ascii="Aptos" w:hAnsi="Aptos"/>
+                <w:rFonts w:ascii="Calibri" w:hAnsi="Calibri"/>
                 <w:color w:val="404040"/>
                 <w:sz w:val="17"/>
               </w:rPr>
@@ -7016,7 +7016,7 @@
           <w:p>
             <w:r>
               <w:rPr>
-                <w:rFonts w:ascii="Aptos" w:hAnsi="Aptos"/>
+                <w:rFonts w:ascii="Calibri" w:hAnsi="Calibri"/>
                 <w:color w:val="404040"/>
                 <w:sz w:val="17"/>
               </w:rPr>
@@ -7033,7 +7033,7 @@
           <w:p>
             <w:r>
               <w:rPr>
-                <w:rFonts w:ascii="Aptos" w:hAnsi="Aptos"/>
+                <w:rFonts w:ascii="Calibri" w:hAnsi="Calibri"/>
                 <w:color w:val="404040"/>
                 <w:sz w:val="17"/>
               </w:rPr>
@@ -7048,7 +7048,7 @@
           <w:p>
             <w:r>
               <w:rPr>
-                <w:rFonts w:ascii="Aptos" w:hAnsi="Aptos"/>
+                <w:rFonts w:ascii="Calibri" w:hAnsi="Calibri"/>
                 <w:color w:val="404040"/>
                 <w:sz w:val="17"/>
               </w:rPr>
@@ -7065,7 +7065,7 @@
           <w:p>
             <w:r>
               <w:rPr>
-                <w:rFonts w:ascii="Aptos" w:hAnsi="Aptos"/>
+                <w:rFonts w:ascii="Calibri" w:hAnsi="Calibri"/>
                 <w:color w:val="404040"/>
                 <w:sz w:val="17"/>
               </w:rPr>
@@ -7080,7 +7080,7 @@
           <w:p>
             <w:r>
               <w:rPr>
-                <w:rFonts w:ascii="Aptos" w:hAnsi="Aptos"/>
+                <w:rFonts w:ascii="Calibri" w:hAnsi="Calibri"/>
                 <w:color w:val="404040"/>
                 <w:sz w:val="17"/>
               </w:rPr>
@@ -7097,7 +7097,7 @@
           <w:p>
             <w:r>
               <w:rPr>
-                <w:rFonts w:ascii="Aptos" w:hAnsi="Aptos"/>
+                <w:rFonts w:ascii="Calibri" w:hAnsi="Calibri"/>
                 <w:color w:val="404040"/>
                 <w:sz w:val="17"/>
               </w:rPr>
@@ -7112,7 +7112,7 @@
           <w:p>
             <w:r>
               <w:rPr>
-                <w:rFonts w:ascii="Aptos" w:hAnsi="Aptos"/>
+                <w:rFonts w:ascii="Calibri" w:hAnsi="Calibri"/>
                 <w:color w:val="404040"/>
                 <w:sz w:val="17"/>
               </w:rPr>
@@ -7129,7 +7129,7 @@
           <w:p>
             <w:r>
               <w:rPr>
-                <w:rFonts w:ascii="Aptos" w:hAnsi="Aptos"/>
+                <w:rFonts w:ascii="Calibri" w:hAnsi="Calibri"/>
                 <w:color w:val="404040"/>
                 <w:sz w:val="17"/>
               </w:rPr>
@@ -7144,7 +7144,7 @@
           <w:p>
             <w:r>
               <w:rPr>
-                <w:rFonts w:ascii="Aptos" w:hAnsi="Aptos"/>
+                <w:rFonts w:ascii="Calibri" w:hAnsi="Calibri"/>
                 <w:color w:val="404040"/>
                 <w:sz w:val="17"/>
               </w:rPr>
@@ -7165,7 +7165,7 @@
       </w:pPr>
       <w:r>
         <w:rPr>
-          <w:rFonts w:ascii="Aptos" w:hAnsi="Aptos"/>
+          <w:rFonts w:ascii="Calibri" w:hAnsi="Calibri"/>
           <w:b w:val="0"/>
           <w:i/>
           <w:color w:val="404040"/>
@@ -7571,7 +7571,7 @@
       <w:spacing w:after="80" w:line="276" w:lineRule="auto" w:before="0"/>
     </w:pPr>
     <w:rPr>
-      <w:rFonts w:ascii="Aptos" w:hAnsi="Aptos"/>
+      <w:rFonts w:ascii="Calibri" w:hAnsi="Calibri"/>
       <w:color w:val="404040"/>
       <w:sz w:val="20"/>
     </w:rPr>

</xml_diff>